<commit_message>
Feature: Attic Greek drills (1-st part)
</commit_message>
<xml_diff>
--- a/site/drills/latin/answers.docx
+++ b/site/drills/latin/answers.docx
@@ -2181,6 +2181,581 @@
       </w:pPr>
       <w:r>
         <w:rPr/>
+      </w:r>
+    </w:p>
+    <w:p>
+      <w:pPr>
+        <w:pStyle w:val="Normal"/>
+        <w:bidi w:val="0"/>
+        <w:jc w:val="left"/>
+        <w:rPr/>
+      </w:pPr>
+      <w:r>
+        <w:rPr/>
+      </w:r>
+    </w:p>
+    <w:p>
+      <w:pPr>
+        <w:pStyle w:val="Normal"/>
+        <w:bidi w:val="0"/>
+        <w:jc w:val="left"/>
+        <w:rPr/>
+      </w:pPr>
+      <w:r>
+        <w:rPr/>
+      </w:r>
+    </w:p>
+    <w:p>
+      <w:pPr>
+        <w:pStyle w:val="Normal"/>
+        <w:bidi w:val="0"/>
+        <w:jc w:val="left"/>
+        <w:rPr/>
+      </w:pPr>
+      <w:r>
+        <w:rPr/>
+      </w:r>
+    </w:p>
+    <w:p>
+      <w:pPr>
+        <w:pStyle w:val="Normal"/>
+        <w:bidi w:val="0"/>
+        <w:jc w:val="left"/>
+        <w:rPr/>
+      </w:pPr>
+      <w:r>
+        <w:rPr/>
+      </w:r>
+    </w:p>
+    <w:p>
+      <w:pPr>
+        <w:pStyle w:val="Normal"/>
+        <w:bidi w:val="0"/>
+        <w:jc w:val="left"/>
+        <w:rPr/>
+      </w:pPr>
+      <w:r>
+        <w:rPr/>
+      </w:r>
+    </w:p>
+    <w:p>
+      <w:pPr>
+        <w:pStyle w:val="Normal"/>
+        <w:bidi w:val="0"/>
+        <w:jc w:val="left"/>
+        <w:rPr/>
+      </w:pPr>
+      <w:r>
+        <w:rPr/>
+      </w:r>
+    </w:p>
+    <w:p>
+      <w:pPr>
+        <w:pStyle w:val="Normal"/>
+        <w:bidi w:val="0"/>
+        <w:jc w:val="left"/>
+        <w:rPr/>
+      </w:pPr>
+      <w:r>
+        <w:rPr/>
+      </w:r>
+    </w:p>
+    <w:p>
+      <w:pPr>
+        <w:pStyle w:val="Normal"/>
+        <w:bidi w:val="0"/>
+        <w:jc w:val="left"/>
+        <w:rPr/>
+      </w:pPr>
+      <w:r>
+        <w:rPr/>
+      </w:r>
+    </w:p>
+    <w:p>
+      <w:pPr>
+        <w:pStyle w:val="Normal"/>
+        <w:bidi w:val="0"/>
+        <w:jc w:val="left"/>
+        <w:rPr/>
+      </w:pPr>
+      <w:r>
+        <w:rPr/>
+      </w:r>
+    </w:p>
+    <w:p>
+      <w:pPr>
+        <w:pStyle w:val="Normal"/>
+        <w:bidi w:val="0"/>
+        <w:jc w:val="left"/>
+        <w:rPr/>
+      </w:pPr>
+      <w:r>
+        <w:rPr/>
+      </w:r>
+    </w:p>
+    <w:p>
+      <w:pPr>
+        <w:pStyle w:val="Normal"/>
+        <w:bidi w:val="0"/>
+        <w:jc w:val="left"/>
+        <w:rPr/>
+      </w:pPr>
+      <w:r>
+        <w:rPr/>
+      </w:r>
+    </w:p>
+    <w:p>
+      <w:pPr>
+        <w:pStyle w:val="Normal"/>
+        <w:bidi w:val="0"/>
+        <w:jc w:val="left"/>
+        <w:rPr/>
+      </w:pPr>
+      <w:r>
+        <w:rPr/>
+      </w:r>
+    </w:p>
+    <w:p>
+      <w:pPr>
+        <w:pStyle w:val="Normal"/>
+        <w:bidi w:val="0"/>
+        <w:jc w:val="left"/>
+        <w:rPr/>
+      </w:pPr>
+      <w:r>
+        <w:rPr/>
+      </w:r>
+    </w:p>
+    <w:p>
+      <w:pPr>
+        <w:pStyle w:val="Normal"/>
+        <w:bidi w:val="0"/>
+        <w:jc w:val="left"/>
+        <w:rPr/>
+      </w:pPr>
+      <w:r>
+        <w:rPr/>
+        <w:t>=== Verb sum ===</w:t>
+      </w:r>
+    </w:p>
+    <w:p>
+      <w:pPr>
+        <w:pStyle w:val="Normal"/>
+        <w:bidi w:val="0"/>
+        <w:jc w:val="left"/>
+        <w:rPr/>
+      </w:pPr>
+      <w:r>
+        <w:rPr/>
+      </w:r>
+    </w:p>
+    <w:p>
+      <w:pPr>
+        <w:pStyle w:val="Normal"/>
+        <w:bidi w:val="0"/>
+        <w:jc w:val="left"/>
+        <w:rPr/>
+      </w:pPr>
+      <w:r>
+        <w:rPr/>
+        <w:t>--- Present Indicative ---</w:t>
+      </w:r>
+    </w:p>
+    <w:p>
+      <w:pPr>
+        <w:pStyle w:val="Normal"/>
+        <w:bidi w:val="0"/>
+        <w:jc w:val="left"/>
+        <w:rPr/>
+      </w:pPr>
+      <w:r>
+        <w:rPr/>
+        <w:t>Be: sum es est sumus estis sunt</w:t>
+      </w:r>
+    </w:p>
+    <w:p>
+      <w:pPr>
+        <w:pStyle w:val="Normal"/>
+        <w:bidi w:val="0"/>
+        <w:jc w:val="left"/>
+        <w:rPr/>
+      </w:pPr>
+      <w:r>
+        <w:rPr/>
+      </w:r>
+    </w:p>
+    <w:p>
+      <w:pPr>
+        <w:pStyle w:val="Normal"/>
+        <w:bidi w:val="0"/>
+        <w:jc w:val="left"/>
+        <w:rPr/>
+      </w:pPr>
+      <w:r>
+        <w:rPr/>
+        <w:t>--- Imperfect Indicative ---</w:t>
+      </w:r>
+    </w:p>
+    <w:p>
+      <w:pPr>
+        <w:pStyle w:val="Normal"/>
+        <w:bidi w:val="0"/>
+        <w:jc w:val="left"/>
+        <w:rPr/>
+      </w:pPr>
+      <w:r>
+        <w:rPr/>
+        <w:t>Be: eram eras erat eramus eratis erant</w:t>
+      </w:r>
+    </w:p>
+    <w:p>
+      <w:pPr>
+        <w:pStyle w:val="Normal"/>
+        <w:bidi w:val="0"/>
+        <w:jc w:val="left"/>
+        <w:rPr/>
+      </w:pPr>
+      <w:r>
+        <w:rPr/>
+      </w:r>
+    </w:p>
+    <w:p>
+      <w:pPr>
+        <w:pStyle w:val="Normal"/>
+        <w:bidi w:val="0"/>
+        <w:jc w:val="left"/>
+        <w:rPr/>
+      </w:pPr>
+      <w:r>
+        <w:rPr/>
+        <w:t>--- Future Indicative ---</w:t>
+      </w:r>
+    </w:p>
+    <w:p>
+      <w:pPr>
+        <w:pStyle w:val="Normal"/>
+        <w:bidi w:val="0"/>
+        <w:jc w:val="left"/>
+        <w:rPr/>
+      </w:pPr>
+      <w:r>
+        <w:rPr/>
+        <w:t>Be: ero eris erit erimus eritis erunt</w:t>
+      </w:r>
+    </w:p>
+    <w:p>
+      <w:pPr>
+        <w:pStyle w:val="Normal"/>
+        <w:bidi w:val="0"/>
+        <w:jc w:val="left"/>
+        <w:rPr/>
+      </w:pPr>
+      <w:r>
+        <w:rPr/>
+      </w:r>
+    </w:p>
+    <w:p>
+      <w:pPr>
+        <w:pStyle w:val="Normal"/>
+        <w:bidi w:val="0"/>
+        <w:jc w:val="left"/>
+        <w:rPr/>
+      </w:pPr>
+      <w:r>
+        <w:rPr/>
+        <w:t>--- Perfect Indicative ---</w:t>
+      </w:r>
+    </w:p>
+    <w:p>
+      <w:pPr>
+        <w:pStyle w:val="Normal"/>
+        <w:bidi w:val="0"/>
+        <w:jc w:val="left"/>
+        <w:rPr/>
+      </w:pPr>
+      <w:r>
+        <w:rPr/>
+        <w:t xml:space="preserve">Be: fui fuisti fuit fuimus fuistis fuerunt </w:t>
+      </w:r>
+    </w:p>
+    <w:p>
+      <w:pPr>
+        <w:pStyle w:val="Normal"/>
+        <w:bidi w:val="0"/>
+        <w:jc w:val="left"/>
+        <w:rPr/>
+      </w:pPr>
+      <w:r>
+        <w:rPr/>
+      </w:r>
+    </w:p>
+    <w:p>
+      <w:pPr>
+        <w:pStyle w:val="Normal"/>
+        <w:bidi w:val="0"/>
+        <w:jc w:val="left"/>
+        <w:rPr/>
+      </w:pPr>
+      <w:r>
+        <w:rPr/>
+        <w:t>--- Pluperfect Indicative ---</w:t>
+      </w:r>
+    </w:p>
+    <w:p>
+      <w:pPr>
+        <w:pStyle w:val="Normal"/>
+        <w:bidi w:val="0"/>
+        <w:jc w:val="left"/>
+        <w:rPr/>
+      </w:pPr>
+      <w:r>
+        <w:rPr/>
+        <w:t>Be: fueram fueras fuerat fueramus fueratis fuerant</w:t>
+      </w:r>
+    </w:p>
+    <w:p>
+      <w:pPr>
+        <w:pStyle w:val="Normal"/>
+        <w:bidi w:val="0"/>
+        <w:jc w:val="left"/>
+        <w:rPr/>
+      </w:pPr>
+      <w:r>
+        <w:rPr/>
+      </w:r>
+    </w:p>
+    <w:p>
+      <w:pPr>
+        <w:pStyle w:val="Normal"/>
+        <w:bidi w:val="0"/>
+        <w:jc w:val="left"/>
+        <w:rPr/>
+      </w:pPr>
+      <w:r>
+        <w:rPr/>
+        <w:t>--- Future Perfect Indicative ---</w:t>
+      </w:r>
+    </w:p>
+    <w:p>
+      <w:pPr>
+        <w:pStyle w:val="Normal"/>
+        <w:bidi w:val="0"/>
+        <w:jc w:val="left"/>
+        <w:rPr/>
+      </w:pPr>
+      <w:r>
+        <w:rPr/>
+        <w:t>Be: fuero fueris fuerit fuerimus fueritis fuerint</w:t>
+      </w:r>
+    </w:p>
+    <w:p>
+      <w:pPr>
+        <w:pStyle w:val="Normal"/>
+        <w:bidi w:val="0"/>
+        <w:jc w:val="left"/>
+        <w:rPr/>
+      </w:pPr>
+      <w:r>
+        <w:rPr/>
+      </w:r>
+    </w:p>
+    <w:p>
+      <w:pPr>
+        <w:pStyle w:val="Normal"/>
+        <w:bidi w:val="0"/>
+        <w:jc w:val="left"/>
+        <w:rPr/>
+      </w:pPr>
+      <w:r>
+        <w:rPr/>
+        <w:t>--- Present Subjunctive ---</w:t>
+      </w:r>
+    </w:p>
+    <w:p>
+      <w:pPr>
+        <w:pStyle w:val="Normal"/>
+        <w:bidi w:val="0"/>
+        <w:jc w:val="left"/>
+        <w:rPr/>
+      </w:pPr>
+      <w:r>
+        <w:rPr/>
+        <w:t>Be: sim sis sit simus sitis sint</w:t>
+      </w:r>
+    </w:p>
+    <w:p>
+      <w:pPr>
+        <w:pStyle w:val="Normal"/>
+        <w:bidi w:val="0"/>
+        <w:jc w:val="left"/>
+        <w:rPr/>
+      </w:pPr>
+      <w:r>
+        <w:rPr/>
+      </w:r>
+    </w:p>
+    <w:p>
+      <w:pPr>
+        <w:pStyle w:val="Normal"/>
+        <w:bidi w:val="0"/>
+        <w:jc w:val="left"/>
+        <w:rPr/>
+      </w:pPr>
+      <w:r>
+        <w:rPr/>
+        <w:t>--- Imperfect Subjunctive ---</w:t>
+      </w:r>
+    </w:p>
+    <w:p>
+      <w:pPr>
+        <w:pStyle w:val="Normal"/>
+        <w:bidi w:val="0"/>
+        <w:jc w:val="left"/>
+        <w:rPr/>
+      </w:pPr>
+      <w:r>
+        <w:rPr/>
+        <w:t>Be: essem esses esset essemus essetis essent</w:t>
+      </w:r>
+    </w:p>
+    <w:p>
+      <w:pPr>
+        <w:pStyle w:val="Normal"/>
+        <w:bidi w:val="0"/>
+        <w:jc w:val="left"/>
+        <w:rPr/>
+      </w:pPr>
+      <w:r>
+        <w:rPr/>
+      </w:r>
+    </w:p>
+    <w:p>
+      <w:pPr>
+        <w:pStyle w:val="Normal"/>
+        <w:bidi w:val="0"/>
+        <w:jc w:val="left"/>
+        <w:rPr/>
+      </w:pPr>
+      <w:r>
+        <w:rPr/>
+        <w:t>--- Perfect Subjunctive ---</w:t>
+      </w:r>
+    </w:p>
+    <w:p>
+      <w:pPr>
+        <w:pStyle w:val="Normal"/>
+        <w:bidi w:val="0"/>
+        <w:jc w:val="left"/>
+        <w:rPr/>
+      </w:pPr>
+      <w:r>
+        <w:rPr/>
+        <w:t>Be: fuerim fueris fuerit fuerimus fueritis fuerint</w:t>
+      </w:r>
+    </w:p>
+    <w:p>
+      <w:pPr>
+        <w:pStyle w:val="Normal"/>
+        <w:bidi w:val="0"/>
+        <w:jc w:val="left"/>
+        <w:rPr/>
+      </w:pPr>
+      <w:r>
+        <w:rPr/>
+      </w:r>
+    </w:p>
+    <w:p>
+      <w:pPr>
+        <w:pStyle w:val="Normal"/>
+        <w:bidi w:val="0"/>
+        <w:jc w:val="left"/>
+        <w:rPr/>
+      </w:pPr>
+      <w:r>
+        <w:rPr/>
+        <w:t>--- Pluperfect Subjunctive ---</w:t>
+      </w:r>
+    </w:p>
+    <w:p>
+      <w:pPr>
+        <w:pStyle w:val="Normal"/>
+        <w:bidi w:val="0"/>
+        <w:jc w:val="left"/>
+        <w:rPr/>
+      </w:pPr>
+      <w:r>
+        <w:rPr/>
+        <w:t>Be: fuissem fuisses fuisset fuissemus fuissetis fuissent</w:t>
+      </w:r>
+    </w:p>
+    <w:p>
+      <w:pPr>
+        <w:pStyle w:val="Normal"/>
+        <w:bidi w:val="0"/>
+        <w:jc w:val="left"/>
+        <w:rPr/>
+      </w:pPr>
+      <w:r>
+        <w:rPr/>
+      </w:r>
+    </w:p>
+    <w:p>
+      <w:pPr>
+        <w:pStyle w:val="Normal"/>
+        <w:bidi w:val="0"/>
+        <w:jc w:val="left"/>
+        <w:rPr/>
+      </w:pPr>
+      <w:r>
+        <w:rPr/>
+        <w:t>--- Present Imperative ---</w:t>
+      </w:r>
+    </w:p>
+    <w:p>
+      <w:pPr>
+        <w:pStyle w:val="Normal"/>
+        <w:bidi w:val="0"/>
+        <w:jc w:val="left"/>
+        <w:rPr/>
+      </w:pPr>
+      <w:r>
+        <w:rPr/>
+        <w:t>Be: es este</w:t>
+      </w:r>
+    </w:p>
+    <w:p>
+      <w:pPr>
+        <w:pStyle w:val="Normal"/>
+        <w:bidi w:val="0"/>
+        <w:jc w:val="left"/>
+        <w:rPr/>
+      </w:pPr>
+      <w:r>
+        <w:rPr/>
+      </w:r>
+    </w:p>
+    <w:p>
+      <w:pPr>
+        <w:pStyle w:val="Normal"/>
+        <w:bidi w:val="0"/>
+        <w:jc w:val="left"/>
+        <w:rPr/>
+      </w:pPr>
+      <w:r>
+        <w:rPr/>
+        <w:t>--- Future Imperative ---</w:t>
+      </w:r>
+    </w:p>
+    <w:p>
+      <w:pPr>
+        <w:pStyle w:val="Normal"/>
+        <w:bidi w:val="0"/>
+        <w:jc w:val="left"/>
+        <w:rPr/>
+      </w:pPr>
+      <w:r>
+        <w:rPr/>
+        <w:t>Be: esto esto estote sunto</w:t>
       </w:r>
     </w:p>
     <w:p>
@@ -7447,7 +8022,7 @@
     </w:r>
     <w:r>
       <w:rPr/>
-      <w:t>13</w:t>
+      <w:t>5</w:t>
     </w:r>
     <w:r>
       <w:rPr/>

</xml_diff>

<commit_message>
[163] Correct Latin drills - change send into lead
</commit_message>
<xml_diff>
--- a/site/drills/latin/answers.docx
+++ b/site/drills/latin/answers.docx
@@ -6412,7 +6412,7 @@
       </w:pPr>
       <w:r>
         <w:rPr/>
-        <w:t>Send: mittens</w:t>
+        <w:t>Lead: ducens</w:t>
       </w:r>
     </w:p>
     <w:p>
@@ -6495,7 +6495,7 @@
       </w:pPr>
       <w:r>
         <w:rPr/>
-        <w:t>Send: ductus</w:t>
+        <w:t>Lead: ductus</w:t>
       </w:r>
     </w:p>
     <w:p>
@@ -6578,7 +6578,7 @@
       </w:pPr>
       <w:r>
         <w:rPr/>
-        <w:t xml:space="preserve">Send: missurus </w:t>
+        <w:t xml:space="preserve">Lead: ducturus </w:t>
       </w:r>
     </w:p>
     <w:p>
@@ -8022,7 +8022,7 @@
     </w:r>
     <w:r>
       <w:rPr/>
-      <w:t>5</w:t>
+      <w:t>11</w:t>
     </w:r>
     <w:r>
       <w:rPr/>

</xml_diff>

<commit_message>
[172]Bug: space missing in Latin drills, Pronouns table
</commit_message>
<xml_diff>
--- a/site/drills/latin/answers.docx
+++ b/site/drills/latin/answers.docx
@@ -1532,7 +1532,7 @@
       </w:pPr>
       <w:r>
         <w:rPr/>
-        <w:t>Those (neuter): illa illorumillis illa illis</w:t>
+        <w:t>Those (neuter): illa illorum illis illa illis</w:t>
       </w:r>
     </w:p>
     <w:p>
@@ -8022,7 +8022,7 @@
     </w:r>
     <w:r>
       <w:rPr/>
-      <w:t>11</w:t>
+      <w:t>2</w:t>
     </w:r>
     <w:r>
       <w:rPr/>

</xml_diff>

<commit_message>
[191]Add iste, ista, istud to Latin drills, Pronouns page
</commit_message>
<xml_diff>
--- a/site/drills/latin/answers.docx
+++ b/site/drills/latin/answers.docx
@@ -1544,6 +1544,78 @@
       </w:pPr>
       <w:r>
         <w:rPr/>
+        <w:t>That of yours (masc.): iste istius isti istum isto</w:t>
+      </w:r>
+    </w:p>
+    <w:p>
+      <w:pPr>
+        <w:pStyle w:val="Normal"/>
+        <w:bidi w:val="0"/>
+        <w:jc w:val="left"/>
+        <w:rPr/>
+      </w:pPr>
+      <w:r>
+        <w:rPr/>
+        <w:t>Those of yours (masc.): isti istorum istis istos istis</w:t>
+      </w:r>
+    </w:p>
+    <w:p>
+      <w:pPr>
+        <w:pStyle w:val="Normal"/>
+        <w:bidi w:val="0"/>
+        <w:jc w:val="left"/>
+        <w:rPr/>
+      </w:pPr>
+      <w:r>
+        <w:rPr/>
+        <w:t>That of yours (fem.): ista istius isti istam ista</w:t>
+      </w:r>
+    </w:p>
+    <w:p>
+      <w:pPr>
+        <w:pStyle w:val="Normal"/>
+        <w:bidi w:val="0"/>
+        <w:jc w:val="left"/>
+        <w:rPr/>
+      </w:pPr>
+      <w:r>
+        <w:rPr/>
+        <w:t>Those of yours (fem.): istae istarum istis istas istis</w:t>
+      </w:r>
+    </w:p>
+    <w:p>
+      <w:pPr>
+        <w:pStyle w:val="Normal"/>
+        <w:bidi w:val="0"/>
+        <w:jc w:val="left"/>
+        <w:rPr/>
+      </w:pPr>
+      <w:r>
+        <w:rPr/>
+        <w:t>That of yours (neut.): istud istius isti istud isto</w:t>
+      </w:r>
+    </w:p>
+    <w:p>
+      <w:pPr>
+        <w:pStyle w:val="Normal"/>
+        <w:bidi w:val="0"/>
+        <w:jc w:val="left"/>
+        <w:rPr/>
+      </w:pPr>
+      <w:r>
+        <w:rPr/>
+        <w:t>Those of yours (neut.): ista istorum istis ista istis</w:t>
+      </w:r>
+    </w:p>
+    <w:p>
+      <w:pPr>
+        <w:pStyle w:val="Normal"/>
+        <w:bidi w:val="0"/>
+        <w:jc w:val="left"/>
+        <w:rPr/>
+      </w:pPr>
+      <w:r>
+        <w:rPr/>
       </w:r>
     </w:p>
     <w:p>
@@ -1818,72 +1890,6 @@
       <w:r>
         <w:rPr/>
         <w:t>Which? (pl. neuter): quae quorum quibus quae quibus</w:t>
-      </w:r>
-    </w:p>
-    <w:p>
-      <w:pPr>
-        <w:pStyle w:val="Normal"/>
-        <w:bidi w:val="0"/>
-        <w:jc w:val="left"/>
-        <w:rPr/>
-      </w:pPr>
-      <w:r>
-        <w:rPr/>
-      </w:r>
-    </w:p>
-    <w:p>
-      <w:pPr>
-        <w:pStyle w:val="Normal"/>
-        <w:bidi w:val="0"/>
-        <w:jc w:val="left"/>
-        <w:rPr/>
-      </w:pPr>
-      <w:r>
-        <w:rPr/>
-      </w:r>
-    </w:p>
-    <w:p>
-      <w:pPr>
-        <w:pStyle w:val="Normal"/>
-        <w:bidi w:val="0"/>
-        <w:jc w:val="left"/>
-        <w:rPr/>
-      </w:pPr>
-      <w:r>
-        <w:rPr/>
-      </w:r>
-    </w:p>
-    <w:p>
-      <w:pPr>
-        <w:pStyle w:val="Normal"/>
-        <w:bidi w:val="0"/>
-        <w:jc w:val="left"/>
-        <w:rPr/>
-      </w:pPr>
-      <w:r>
-        <w:rPr/>
-      </w:r>
-    </w:p>
-    <w:p>
-      <w:pPr>
-        <w:pStyle w:val="Normal"/>
-        <w:bidi w:val="0"/>
-        <w:jc w:val="left"/>
-        <w:rPr/>
-      </w:pPr>
-      <w:r>
-        <w:rPr/>
-      </w:r>
-    </w:p>
-    <w:p>
-      <w:pPr>
-        <w:pStyle w:val="Normal"/>
-        <w:bidi w:val="0"/>
-        <w:jc w:val="left"/>
-        <w:rPr/>
-      </w:pPr>
-      <w:r>
-        <w:rPr/>
       </w:r>
     </w:p>
     <w:p>
@@ -8022,7 +8028,7 @@
     </w:r>
     <w:r>
       <w:rPr/>
-      <w:t>2</w:t>
+      <w:t>14</w:t>
     </w:r>
     <w:r>
       <w:rPr/>

</xml_diff>

<commit_message>
[191]Add iste, ista, istud to Latin drills, Pronouns page 2 part
</commit_message>
<xml_diff>
--- a/site/drills/latin/answers.docx
+++ b/site/drills/latin/answers.docx
@@ -34,6 +34,173 @@
       </w:pPr>
       <w:r>
         <w:rPr/>
+        <w:t>--- 1-st decl. porta ---</w:t>
+      </w:r>
+    </w:p>
+    <w:p>
+      <w:pPr>
+        <w:pStyle w:val="Normal"/>
+        <w:bidi w:val="0"/>
+        <w:jc w:val="left"/>
+        <w:rPr/>
+      </w:pPr>
+      <w:r>
+        <w:rPr/>
+        <w:t>--- 2-nd decl. amicus ---</w:t>
+      </w:r>
+    </w:p>
+    <w:p>
+      <w:pPr>
+        <w:pStyle w:val="Normal"/>
+        <w:bidi w:val="0"/>
+        <w:jc w:val="left"/>
+        <w:rPr/>
+      </w:pPr>
+      <w:r>
+        <w:rPr/>
+        <w:t>--- 2-nd decl. puer ---</w:t>
+      </w:r>
+    </w:p>
+    <w:p>
+      <w:pPr>
+        <w:pStyle w:val="Normal"/>
+        <w:bidi w:val="0"/>
+        <w:jc w:val="left"/>
+        <w:rPr/>
+      </w:pPr>
+      <w:r>
+        <w:rPr/>
+        <w:t>--- 2-nd decl. ager ---</w:t>
+      </w:r>
+    </w:p>
+    <w:p>
+      <w:pPr>
+        <w:pStyle w:val="Normal"/>
+        <w:bidi w:val="0"/>
+        <w:jc w:val="left"/>
+        <w:rPr/>
+      </w:pPr>
+      <w:r>
+        <w:rPr/>
+        <w:t>--- 2-nd decl. donum ---</w:t>
+      </w:r>
+    </w:p>
+    <w:p>
+      <w:pPr>
+        <w:pStyle w:val="Normal"/>
+        <w:bidi w:val="0"/>
+        <w:jc w:val="left"/>
+        <w:rPr/>
+      </w:pPr>
+      <w:r>
+        <w:rPr/>
+        <w:t>--- 3-rd decl. rex ---</w:t>
+      </w:r>
+    </w:p>
+    <w:p>
+      <w:pPr>
+        <w:pStyle w:val="Normal"/>
+        <w:bidi w:val="0"/>
+        <w:jc w:val="left"/>
+        <w:rPr/>
+      </w:pPr>
+      <w:r>
+        <w:rPr/>
+        <w:t>--- 3-rd decl. corpus ---</w:t>
+      </w:r>
+    </w:p>
+    <w:p>
+      <w:pPr>
+        <w:pStyle w:val="Normal"/>
+        <w:bidi w:val="0"/>
+        <w:jc w:val="left"/>
+        <w:rPr/>
+      </w:pPr>
+      <w:r>
+        <w:rPr/>
+        <w:t>--- 3-rd decl. i-stem civis ---</w:t>
+      </w:r>
+    </w:p>
+    <w:p>
+      <w:pPr>
+        <w:pStyle w:val="Normal"/>
+        <w:bidi w:val="0"/>
+        <w:jc w:val="left"/>
+        <w:rPr/>
+      </w:pPr>
+      <w:r>
+        <w:rPr/>
+        <w:t>--- 3-rd decl. i-stem urbs ---</w:t>
+      </w:r>
+    </w:p>
+    <w:p>
+      <w:pPr>
+        <w:pStyle w:val="Normal"/>
+        <w:bidi w:val="0"/>
+        <w:jc w:val="left"/>
+        <w:rPr/>
+      </w:pPr>
+      <w:r>
+        <w:rPr/>
+        <w:t>--- 3-rd decl. i-stem mare ---</w:t>
+      </w:r>
+    </w:p>
+    <w:p>
+      <w:pPr>
+        <w:pStyle w:val="Normal"/>
+        <w:bidi w:val="0"/>
+        <w:jc w:val="left"/>
+        <w:rPr/>
+      </w:pPr>
+      <w:r>
+        <w:rPr/>
+        <w:t>--- 4-th decl. fructus ---</w:t>
+      </w:r>
+    </w:p>
+    <w:p>
+      <w:pPr>
+        <w:pStyle w:val="Normal"/>
+        <w:bidi w:val="0"/>
+        <w:jc w:val="left"/>
+        <w:rPr/>
+      </w:pPr>
+      <w:r>
+        <w:rPr/>
+        <w:t>--- 4-th decl. cornu ---</w:t>
+      </w:r>
+    </w:p>
+    <w:p>
+      <w:pPr>
+        <w:pStyle w:val="Normal"/>
+        <w:bidi w:val="0"/>
+        <w:jc w:val="left"/>
+        <w:rPr/>
+      </w:pPr>
+      <w:r>
+        <w:rPr/>
+        <w:t>--- 5-th decl. dies ---</w:t>
+      </w:r>
+    </w:p>
+    <w:p>
+      <w:pPr>
+        <w:pStyle w:val="Normal"/>
+        <w:bidi w:val="0"/>
+        <w:jc w:val="left"/>
+        <w:rPr/>
+      </w:pPr>
+      <w:r>
+        <w:rPr/>
+      </w:r>
+    </w:p>
+    <w:p>
+      <w:pPr>
+        <w:pStyle w:val="Normal"/>
+        <w:bidi w:val="0"/>
+        <w:jc w:val="left"/>
+        <w:rPr/>
+      </w:pPr>
+      <w:r>
+        <w:rPr/>
         <w:t>--- First Declension ---</w:t>
       </w:r>
     </w:p>
@@ -594,6 +761,402 @@
       </w:pPr>
       <w:r>
         <w:rPr/>
+      </w:r>
+    </w:p>
+    <w:p>
+      <w:pPr>
+        <w:pStyle w:val="Normal"/>
+        <w:bidi w:val="0"/>
+        <w:jc w:val="left"/>
+        <w:rPr/>
+      </w:pPr>
+      <w:r>
+        <w:rPr/>
+      </w:r>
+    </w:p>
+    <w:p>
+      <w:pPr>
+        <w:pStyle w:val="Normal"/>
+        <w:bidi w:val="0"/>
+        <w:jc w:val="left"/>
+        <w:rPr/>
+      </w:pPr>
+      <w:r>
+        <w:rPr/>
+      </w:r>
+    </w:p>
+    <w:p>
+      <w:pPr>
+        <w:pStyle w:val="Normal"/>
+        <w:bidi w:val="0"/>
+        <w:jc w:val="left"/>
+        <w:rPr/>
+      </w:pPr>
+      <w:r>
+        <w:rPr/>
+      </w:r>
+    </w:p>
+    <w:p>
+      <w:pPr>
+        <w:pStyle w:val="Normal"/>
+        <w:bidi w:val="0"/>
+        <w:jc w:val="left"/>
+        <w:rPr/>
+      </w:pPr>
+      <w:r>
+        <w:rPr/>
+      </w:r>
+    </w:p>
+    <w:p>
+      <w:pPr>
+        <w:pStyle w:val="Normal"/>
+        <w:bidi w:val="0"/>
+        <w:jc w:val="left"/>
+        <w:rPr/>
+      </w:pPr>
+      <w:r>
+        <w:rPr/>
+      </w:r>
+    </w:p>
+    <w:p>
+      <w:pPr>
+        <w:pStyle w:val="Normal"/>
+        <w:bidi w:val="0"/>
+        <w:jc w:val="left"/>
+        <w:rPr/>
+      </w:pPr>
+      <w:r>
+        <w:rPr/>
+      </w:r>
+    </w:p>
+    <w:p>
+      <w:pPr>
+        <w:pStyle w:val="Normal"/>
+        <w:bidi w:val="0"/>
+        <w:jc w:val="left"/>
+        <w:rPr/>
+      </w:pPr>
+      <w:r>
+        <w:rPr/>
+      </w:r>
+    </w:p>
+    <w:p>
+      <w:pPr>
+        <w:pStyle w:val="Normal"/>
+        <w:bidi w:val="0"/>
+        <w:jc w:val="left"/>
+        <w:rPr/>
+      </w:pPr>
+      <w:r>
+        <w:rPr/>
+      </w:r>
+    </w:p>
+    <w:p>
+      <w:pPr>
+        <w:pStyle w:val="Normal"/>
+        <w:bidi w:val="0"/>
+        <w:jc w:val="left"/>
+        <w:rPr/>
+      </w:pPr>
+      <w:r>
+        <w:rPr/>
+      </w:r>
+    </w:p>
+    <w:p>
+      <w:pPr>
+        <w:pStyle w:val="Normal"/>
+        <w:bidi w:val="0"/>
+        <w:jc w:val="left"/>
+        <w:rPr/>
+      </w:pPr>
+      <w:r>
+        <w:rPr/>
+      </w:r>
+    </w:p>
+    <w:p>
+      <w:pPr>
+        <w:pStyle w:val="Normal"/>
+        <w:bidi w:val="0"/>
+        <w:jc w:val="left"/>
+        <w:rPr/>
+      </w:pPr>
+      <w:r>
+        <w:rPr/>
+      </w:r>
+    </w:p>
+    <w:p>
+      <w:pPr>
+        <w:pStyle w:val="Normal"/>
+        <w:bidi w:val="0"/>
+        <w:jc w:val="left"/>
+        <w:rPr/>
+      </w:pPr>
+      <w:r>
+        <w:rPr/>
+      </w:r>
+    </w:p>
+    <w:p>
+      <w:pPr>
+        <w:pStyle w:val="Normal"/>
+        <w:bidi w:val="0"/>
+        <w:jc w:val="left"/>
+        <w:rPr/>
+      </w:pPr>
+      <w:r>
+        <w:rPr/>
+      </w:r>
+    </w:p>
+    <w:p>
+      <w:pPr>
+        <w:pStyle w:val="Normal"/>
+        <w:bidi w:val="0"/>
+        <w:jc w:val="left"/>
+        <w:rPr/>
+      </w:pPr>
+      <w:r>
+        <w:rPr/>
+      </w:r>
+    </w:p>
+    <w:p>
+      <w:pPr>
+        <w:pStyle w:val="Normal"/>
+        <w:bidi w:val="0"/>
+        <w:jc w:val="left"/>
+        <w:rPr/>
+      </w:pPr>
+      <w:r>
+        <w:rPr/>
+      </w:r>
+    </w:p>
+    <w:p>
+      <w:pPr>
+        <w:pStyle w:val="Normal"/>
+        <w:bidi w:val="0"/>
+        <w:jc w:val="left"/>
+        <w:rPr/>
+      </w:pPr>
+      <w:r>
+        <w:rPr/>
+      </w:r>
+    </w:p>
+    <w:p>
+      <w:pPr>
+        <w:pStyle w:val="Normal"/>
+        <w:bidi w:val="0"/>
+        <w:jc w:val="left"/>
+        <w:rPr/>
+      </w:pPr>
+      <w:r>
+        <w:rPr/>
+      </w:r>
+    </w:p>
+    <w:p>
+      <w:pPr>
+        <w:pStyle w:val="Normal"/>
+        <w:bidi w:val="0"/>
+        <w:jc w:val="left"/>
+        <w:rPr/>
+      </w:pPr>
+      <w:r>
+        <w:rPr/>
+      </w:r>
+    </w:p>
+    <w:p>
+      <w:pPr>
+        <w:pStyle w:val="Normal"/>
+        <w:bidi w:val="0"/>
+        <w:jc w:val="left"/>
+        <w:rPr/>
+      </w:pPr>
+      <w:r>
+        <w:rPr/>
+      </w:r>
+    </w:p>
+    <w:p>
+      <w:pPr>
+        <w:pStyle w:val="Normal"/>
+        <w:bidi w:val="0"/>
+        <w:jc w:val="left"/>
+        <w:rPr/>
+      </w:pPr>
+      <w:r>
+        <w:rPr/>
+      </w:r>
+    </w:p>
+    <w:p>
+      <w:pPr>
+        <w:pStyle w:val="Normal"/>
+        <w:bidi w:val="0"/>
+        <w:jc w:val="left"/>
+        <w:rPr/>
+      </w:pPr>
+      <w:r>
+        <w:rPr/>
+      </w:r>
+    </w:p>
+    <w:p>
+      <w:pPr>
+        <w:pStyle w:val="Normal"/>
+        <w:bidi w:val="0"/>
+        <w:jc w:val="left"/>
+        <w:rPr/>
+      </w:pPr>
+      <w:r>
+        <w:rPr/>
+      </w:r>
+    </w:p>
+    <w:p>
+      <w:pPr>
+        <w:pStyle w:val="Normal"/>
+        <w:bidi w:val="0"/>
+        <w:jc w:val="left"/>
+        <w:rPr/>
+      </w:pPr>
+      <w:r>
+        <w:rPr/>
+      </w:r>
+    </w:p>
+    <w:p>
+      <w:pPr>
+        <w:pStyle w:val="Normal"/>
+        <w:bidi w:val="0"/>
+        <w:jc w:val="left"/>
+        <w:rPr/>
+      </w:pPr>
+      <w:r>
+        <w:rPr/>
+      </w:r>
+    </w:p>
+    <w:p>
+      <w:pPr>
+        <w:pStyle w:val="Normal"/>
+        <w:bidi w:val="0"/>
+        <w:jc w:val="left"/>
+        <w:rPr/>
+      </w:pPr>
+      <w:r>
+        <w:rPr/>
+      </w:r>
+    </w:p>
+    <w:p>
+      <w:pPr>
+        <w:pStyle w:val="Normal"/>
+        <w:bidi w:val="0"/>
+        <w:jc w:val="left"/>
+        <w:rPr/>
+      </w:pPr>
+      <w:r>
+        <w:rPr/>
+      </w:r>
+    </w:p>
+    <w:p>
+      <w:pPr>
+        <w:pStyle w:val="Normal"/>
+        <w:bidi w:val="0"/>
+        <w:jc w:val="left"/>
+        <w:rPr/>
+      </w:pPr>
+      <w:r>
+        <w:rPr/>
+      </w:r>
+    </w:p>
+    <w:p>
+      <w:pPr>
+        <w:pStyle w:val="Normal"/>
+        <w:bidi w:val="0"/>
+        <w:jc w:val="left"/>
+        <w:rPr/>
+      </w:pPr>
+      <w:r>
+        <w:rPr/>
+      </w:r>
+    </w:p>
+    <w:p>
+      <w:pPr>
+        <w:pStyle w:val="Normal"/>
+        <w:bidi w:val="0"/>
+        <w:jc w:val="left"/>
+        <w:rPr/>
+      </w:pPr>
+      <w:r>
+        <w:rPr/>
+      </w:r>
+    </w:p>
+    <w:p>
+      <w:pPr>
+        <w:pStyle w:val="Normal"/>
+        <w:bidi w:val="0"/>
+        <w:jc w:val="left"/>
+        <w:rPr/>
+      </w:pPr>
+      <w:r>
+        <w:rPr/>
+      </w:r>
+    </w:p>
+    <w:p>
+      <w:pPr>
+        <w:pStyle w:val="Normal"/>
+        <w:bidi w:val="0"/>
+        <w:jc w:val="left"/>
+        <w:rPr/>
+      </w:pPr>
+      <w:r>
+        <w:rPr/>
+      </w:r>
+    </w:p>
+    <w:p>
+      <w:pPr>
+        <w:pStyle w:val="Normal"/>
+        <w:bidi w:val="0"/>
+        <w:jc w:val="left"/>
+        <w:rPr/>
+      </w:pPr>
+      <w:r>
+        <w:rPr/>
+      </w:r>
+    </w:p>
+    <w:p>
+      <w:pPr>
+        <w:pStyle w:val="Normal"/>
+        <w:bidi w:val="0"/>
+        <w:jc w:val="left"/>
+        <w:rPr/>
+      </w:pPr>
+      <w:r>
+        <w:rPr/>
+      </w:r>
+    </w:p>
+    <w:p>
+      <w:pPr>
+        <w:pStyle w:val="Normal"/>
+        <w:bidi w:val="0"/>
+        <w:jc w:val="left"/>
+        <w:rPr/>
+      </w:pPr>
+      <w:r>
+        <w:rPr/>
+      </w:r>
+    </w:p>
+    <w:p>
+      <w:pPr>
+        <w:pStyle w:val="Normal"/>
+        <w:bidi w:val="0"/>
+        <w:jc w:val="left"/>
+        <w:rPr/>
+      </w:pPr>
+      <w:r>
+        <w:rPr/>
+      </w:r>
+    </w:p>
+    <w:p>
+      <w:pPr>
+        <w:pStyle w:val="Normal"/>
+        <w:bidi w:val="0"/>
+        <w:jc w:val="left"/>
+        <w:rPr/>
+      </w:pPr>
+      <w:r>
+        <w:rPr/>
         <w:t>=== Adjectives ===</w:t>
       </w:r>
     </w:p>
@@ -617,6 +1180,101 @@
       </w:pPr>
       <w:r>
         <w:rPr/>
+        <w:t>--- 1-st and 2-nd decl. magnus ---</w:t>
+      </w:r>
+    </w:p>
+    <w:p>
+      <w:pPr>
+        <w:pStyle w:val="Normal"/>
+        <w:bidi w:val="0"/>
+        <w:jc w:val="left"/>
+        <w:rPr/>
+      </w:pPr>
+      <w:r>
+        <w:rPr/>
+        <w:t>--- 1-st and 2-nd decl. liber ---</w:t>
+      </w:r>
+    </w:p>
+    <w:p>
+      <w:pPr>
+        <w:pStyle w:val="Normal"/>
+        <w:bidi w:val="0"/>
+        <w:jc w:val="left"/>
+        <w:rPr/>
+      </w:pPr>
+      <w:r>
+        <w:rPr/>
+        <w:t>--- 1-st and 2-nd decl. pulcher ---</w:t>
+      </w:r>
+    </w:p>
+    <w:p>
+      <w:pPr>
+        <w:pStyle w:val="Normal"/>
+        <w:bidi w:val="0"/>
+        <w:jc w:val="left"/>
+        <w:rPr/>
+      </w:pPr>
+      <w:r>
+        <w:rPr/>
+        <w:t>--- 3-rd decl. two endings fortis ---</w:t>
+      </w:r>
+    </w:p>
+    <w:p>
+      <w:pPr>
+        <w:pStyle w:val="Normal"/>
+        <w:bidi w:val="0"/>
+        <w:jc w:val="left"/>
+        <w:rPr/>
+      </w:pPr>
+      <w:r>
+        <w:rPr/>
+        <w:t>--- 3-rd decl. three endings acer ---</w:t>
+      </w:r>
+    </w:p>
+    <w:p>
+      <w:pPr>
+        <w:pStyle w:val="Normal"/>
+        <w:bidi w:val="0"/>
+        <w:jc w:val="left"/>
+        <w:rPr/>
+      </w:pPr>
+      <w:r>
+        <w:rPr/>
+        <w:t>--- 3-rd decl. one ending potens ---</w:t>
+      </w:r>
+    </w:p>
+    <w:p>
+      <w:pPr>
+        <w:pStyle w:val="Normal"/>
+        <w:bidi w:val="0"/>
+        <w:jc w:val="left"/>
+        <w:rPr/>
+      </w:pPr>
+      <w:r>
+        <w:rPr/>
+        <w:t>--- 3-rd decl. comparative fortior ---</w:t>
+      </w:r>
+    </w:p>
+    <w:p>
+      <w:pPr>
+        <w:pStyle w:val="Normal"/>
+        <w:bidi w:val="0"/>
+        <w:jc w:val="left"/>
+        <w:rPr/>
+      </w:pPr>
+      <w:r>
+        <w:rPr/>
+      </w:r>
+    </w:p>
+    <w:p>
+      <w:pPr>
+        <w:pStyle w:val="Normal"/>
+        <w:bidi w:val="0"/>
+        <w:jc w:val="left"/>
+        <w:rPr/>
+      </w:pPr>
+      <w:r>
+        <w:rPr/>
         <w:t>--- First and Second Declensions ---</w:t>
       </w:r>
     </w:p>
@@ -1187,6 +1845,468 @@
       </w:pPr>
       <w:r>
         <w:rPr/>
+      </w:r>
+    </w:p>
+    <w:p>
+      <w:pPr>
+        <w:pStyle w:val="Normal"/>
+        <w:bidi w:val="0"/>
+        <w:jc w:val="left"/>
+        <w:rPr/>
+      </w:pPr>
+      <w:r>
+        <w:rPr/>
+      </w:r>
+    </w:p>
+    <w:p>
+      <w:pPr>
+        <w:pStyle w:val="Normal"/>
+        <w:bidi w:val="0"/>
+        <w:jc w:val="left"/>
+        <w:rPr/>
+      </w:pPr>
+      <w:r>
+        <w:rPr/>
+      </w:r>
+    </w:p>
+    <w:p>
+      <w:pPr>
+        <w:pStyle w:val="Normal"/>
+        <w:bidi w:val="0"/>
+        <w:jc w:val="left"/>
+        <w:rPr/>
+      </w:pPr>
+      <w:r>
+        <w:rPr/>
+      </w:r>
+    </w:p>
+    <w:p>
+      <w:pPr>
+        <w:pStyle w:val="Normal"/>
+        <w:bidi w:val="0"/>
+        <w:jc w:val="left"/>
+        <w:rPr/>
+      </w:pPr>
+      <w:r>
+        <w:rPr/>
+      </w:r>
+    </w:p>
+    <w:p>
+      <w:pPr>
+        <w:pStyle w:val="Normal"/>
+        <w:bidi w:val="0"/>
+        <w:jc w:val="left"/>
+        <w:rPr/>
+      </w:pPr>
+      <w:r>
+        <w:rPr/>
+      </w:r>
+    </w:p>
+    <w:p>
+      <w:pPr>
+        <w:pStyle w:val="Normal"/>
+        <w:bidi w:val="0"/>
+        <w:jc w:val="left"/>
+        <w:rPr/>
+      </w:pPr>
+      <w:r>
+        <w:rPr/>
+      </w:r>
+    </w:p>
+    <w:p>
+      <w:pPr>
+        <w:pStyle w:val="Normal"/>
+        <w:bidi w:val="0"/>
+        <w:jc w:val="left"/>
+        <w:rPr/>
+      </w:pPr>
+      <w:r>
+        <w:rPr/>
+      </w:r>
+    </w:p>
+    <w:p>
+      <w:pPr>
+        <w:pStyle w:val="Normal"/>
+        <w:bidi w:val="0"/>
+        <w:jc w:val="left"/>
+        <w:rPr/>
+      </w:pPr>
+      <w:r>
+        <w:rPr/>
+      </w:r>
+    </w:p>
+    <w:p>
+      <w:pPr>
+        <w:pStyle w:val="Normal"/>
+        <w:bidi w:val="0"/>
+        <w:jc w:val="left"/>
+        <w:rPr/>
+      </w:pPr>
+      <w:r>
+        <w:rPr/>
+      </w:r>
+    </w:p>
+    <w:p>
+      <w:pPr>
+        <w:pStyle w:val="Normal"/>
+        <w:bidi w:val="0"/>
+        <w:jc w:val="left"/>
+        <w:rPr/>
+      </w:pPr>
+      <w:r>
+        <w:rPr/>
+      </w:r>
+    </w:p>
+    <w:p>
+      <w:pPr>
+        <w:pStyle w:val="Normal"/>
+        <w:bidi w:val="0"/>
+        <w:jc w:val="left"/>
+        <w:rPr/>
+      </w:pPr>
+      <w:r>
+        <w:rPr/>
+      </w:r>
+    </w:p>
+    <w:p>
+      <w:pPr>
+        <w:pStyle w:val="Normal"/>
+        <w:bidi w:val="0"/>
+        <w:jc w:val="left"/>
+        <w:rPr/>
+      </w:pPr>
+      <w:r>
+        <w:rPr/>
+      </w:r>
+    </w:p>
+    <w:p>
+      <w:pPr>
+        <w:pStyle w:val="Normal"/>
+        <w:bidi w:val="0"/>
+        <w:jc w:val="left"/>
+        <w:rPr/>
+      </w:pPr>
+      <w:r>
+        <w:rPr/>
+      </w:r>
+    </w:p>
+    <w:p>
+      <w:pPr>
+        <w:pStyle w:val="Normal"/>
+        <w:bidi w:val="0"/>
+        <w:jc w:val="left"/>
+        <w:rPr/>
+      </w:pPr>
+      <w:r>
+        <w:rPr/>
+      </w:r>
+    </w:p>
+    <w:p>
+      <w:pPr>
+        <w:pStyle w:val="Normal"/>
+        <w:bidi w:val="0"/>
+        <w:jc w:val="left"/>
+        <w:rPr/>
+      </w:pPr>
+      <w:r>
+        <w:rPr/>
+      </w:r>
+    </w:p>
+    <w:p>
+      <w:pPr>
+        <w:pStyle w:val="Normal"/>
+        <w:bidi w:val="0"/>
+        <w:jc w:val="left"/>
+        <w:rPr/>
+      </w:pPr>
+      <w:r>
+        <w:rPr/>
+      </w:r>
+    </w:p>
+    <w:p>
+      <w:pPr>
+        <w:pStyle w:val="Normal"/>
+        <w:bidi w:val="0"/>
+        <w:jc w:val="left"/>
+        <w:rPr/>
+      </w:pPr>
+      <w:r>
+        <w:rPr/>
+      </w:r>
+    </w:p>
+    <w:p>
+      <w:pPr>
+        <w:pStyle w:val="Normal"/>
+        <w:bidi w:val="0"/>
+        <w:jc w:val="left"/>
+        <w:rPr/>
+      </w:pPr>
+      <w:r>
+        <w:rPr/>
+      </w:r>
+    </w:p>
+    <w:p>
+      <w:pPr>
+        <w:pStyle w:val="Normal"/>
+        <w:bidi w:val="0"/>
+        <w:jc w:val="left"/>
+        <w:rPr/>
+      </w:pPr>
+      <w:r>
+        <w:rPr/>
+      </w:r>
+    </w:p>
+    <w:p>
+      <w:pPr>
+        <w:pStyle w:val="Normal"/>
+        <w:bidi w:val="0"/>
+        <w:jc w:val="left"/>
+        <w:rPr/>
+      </w:pPr>
+      <w:r>
+        <w:rPr/>
+      </w:r>
+    </w:p>
+    <w:p>
+      <w:pPr>
+        <w:pStyle w:val="Normal"/>
+        <w:bidi w:val="0"/>
+        <w:jc w:val="left"/>
+        <w:rPr/>
+      </w:pPr>
+      <w:r>
+        <w:rPr/>
+      </w:r>
+    </w:p>
+    <w:p>
+      <w:pPr>
+        <w:pStyle w:val="Normal"/>
+        <w:bidi w:val="0"/>
+        <w:jc w:val="left"/>
+        <w:rPr/>
+      </w:pPr>
+      <w:r>
+        <w:rPr/>
+      </w:r>
+    </w:p>
+    <w:p>
+      <w:pPr>
+        <w:pStyle w:val="Normal"/>
+        <w:bidi w:val="0"/>
+        <w:jc w:val="left"/>
+        <w:rPr/>
+      </w:pPr>
+      <w:r>
+        <w:rPr/>
+      </w:r>
+    </w:p>
+    <w:p>
+      <w:pPr>
+        <w:pStyle w:val="Normal"/>
+        <w:bidi w:val="0"/>
+        <w:jc w:val="left"/>
+        <w:rPr/>
+      </w:pPr>
+      <w:r>
+        <w:rPr/>
+      </w:r>
+    </w:p>
+    <w:p>
+      <w:pPr>
+        <w:pStyle w:val="Normal"/>
+        <w:bidi w:val="0"/>
+        <w:jc w:val="left"/>
+        <w:rPr/>
+      </w:pPr>
+      <w:r>
+        <w:rPr/>
+      </w:r>
+    </w:p>
+    <w:p>
+      <w:pPr>
+        <w:pStyle w:val="Normal"/>
+        <w:bidi w:val="0"/>
+        <w:jc w:val="left"/>
+        <w:rPr/>
+      </w:pPr>
+      <w:r>
+        <w:rPr/>
+      </w:r>
+    </w:p>
+    <w:p>
+      <w:pPr>
+        <w:pStyle w:val="Normal"/>
+        <w:bidi w:val="0"/>
+        <w:jc w:val="left"/>
+        <w:rPr/>
+      </w:pPr>
+      <w:r>
+        <w:rPr/>
+      </w:r>
+    </w:p>
+    <w:p>
+      <w:pPr>
+        <w:pStyle w:val="Normal"/>
+        <w:bidi w:val="0"/>
+        <w:jc w:val="left"/>
+        <w:rPr/>
+      </w:pPr>
+      <w:r>
+        <w:rPr/>
+      </w:r>
+    </w:p>
+    <w:p>
+      <w:pPr>
+        <w:pStyle w:val="Normal"/>
+        <w:bidi w:val="0"/>
+        <w:jc w:val="left"/>
+        <w:rPr/>
+      </w:pPr>
+      <w:r>
+        <w:rPr/>
+      </w:r>
+    </w:p>
+    <w:p>
+      <w:pPr>
+        <w:pStyle w:val="Normal"/>
+        <w:bidi w:val="0"/>
+        <w:jc w:val="left"/>
+        <w:rPr/>
+      </w:pPr>
+      <w:r>
+        <w:rPr/>
+      </w:r>
+    </w:p>
+    <w:p>
+      <w:pPr>
+        <w:pStyle w:val="Normal"/>
+        <w:bidi w:val="0"/>
+        <w:jc w:val="left"/>
+        <w:rPr/>
+      </w:pPr>
+      <w:r>
+        <w:rPr/>
+      </w:r>
+    </w:p>
+    <w:p>
+      <w:pPr>
+        <w:pStyle w:val="Normal"/>
+        <w:bidi w:val="0"/>
+        <w:jc w:val="left"/>
+        <w:rPr/>
+      </w:pPr>
+      <w:r>
+        <w:rPr/>
+      </w:r>
+    </w:p>
+    <w:p>
+      <w:pPr>
+        <w:pStyle w:val="Normal"/>
+        <w:bidi w:val="0"/>
+        <w:jc w:val="left"/>
+        <w:rPr/>
+      </w:pPr>
+      <w:r>
+        <w:rPr/>
+      </w:r>
+    </w:p>
+    <w:p>
+      <w:pPr>
+        <w:pStyle w:val="Normal"/>
+        <w:bidi w:val="0"/>
+        <w:jc w:val="left"/>
+        <w:rPr/>
+      </w:pPr>
+      <w:r>
+        <w:rPr/>
+      </w:r>
+    </w:p>
+    <w:p>
+      <w:pPr>
+        <w:pStyle w:val="Normal"/>
+        <w:bidi w:val="0"/>
+        <w:jc w:val="left"/>
+        <w:rPr/>
+      </w:pPr>
+      <w:r>
+        <w:rPr/>
+      </w:r>
+    </w:p>
+    <w:p>
+      <w:pPr>
+        <w:pStyle w:val="Normal"/>
+        <w:bidi w:val="0"/>
+        <w:jc w:val="left"/>
+        <w:rPr/>
+      </w:pPr>
+      <w:r>
+        <w:rPr/>
+      </w:r>
+    </w:p>
+    <w:p>
+      <w:pPr>
+        <w:pStyle w:val="Normal"/>
+        <w:bidi w:val="0"/>
+        <w:jc w:val="left"/>
+        <w:rPr/>
+      </w:pPr>
+      <w:r>
+        <w:rPr/>
+      </w:r>
+    </w:p>
+    <w:p>
+      <w:pPr>
+        <w:pStyle w:val="Normal"/>
+        <w:bidi w:val="0"/>
+        <w:jc w:val="left"/>
+        <w:rPr/>
+      </w:pPr>
+      <w:r>
+        <w:rPr/>
+      </w:r>
+    </w:p>
+    <w:p>
+      <w:pPr>
+        <w:pStyle w:val="Normal"/>
+        <w:bidi w:val="0"/>
+        <w:jc w:val="left"/>
+        <w:rPr/>
+      </w:pPr>
+      <w:r>
+        <w:rPr/>
+      </w:r>
+    </w:p>
+    <w:p>
+      <w:pPr>
+        <w:pStyle w:val="Normal"/>
+        <w:bidi w:val="0"/>
+        <w:jc w:val="left"/>
+        <w:rPr/>
+      </w:pPr>
+      <w:r>
+        <w:rPr/>
+      </w:r>
+    </w:p>
+    <w:p>
+      <w:pPr>
+        <w:pStyle w:val="Normal"/>
+        <w:bidi w:val="0"/>
+        <w:jc w:val="left"/>
+        <w:rPr/>
+      </w:pPr>
+      <w:r>
+        <w:rPr/>
+      </w:r>
+    </w:p>
+    <w:p>
+      <w:pPr>
+        <w:pStyle w:val="Normal"/>
+        <w:bidi w:val="0"/>
+        <w:jc w:val="left"/>
+        <w:rPr/>
+      </w:pPr>
+      <w:r>
+        <w:rPr/>
         <w:t>=== Pronouns ===</w:t>
       </w:r>
     </w:p>
@@ -1210,6 +2330,173 @@
       </w:pPr>
       <w:r>
         <w:rPr/>
+        <w:t>--- Personal ego ---</w:t>
+      </w:r>
+    </w:p>
+    <w:p>
+      <w:pPr>
+        <w:pStyle w:val="Normal"/>
+        <w:bidi w:val="0"/>
+        <w:jc w:val="left"/>
+        <w:rPr/>
+      </w:pPr>
+      <w:r>
+        <w:rPr/>
+        <w:t>--- Personal tu ---</w:t>
+      </w:r>
+    </w:p>
+    <w:p>
+      <w:pPr>
+        <w:pStyle w:val="Normal"/>
+        <w:bidi w:val="0"/>
+        <w:jc w:val="left"/>
+        <w:rPr/>
+      </w:pPr>
+      <w:r>
+        <w:rPr/>
+        <w:t>--- Personal is, ea, id ---</w:t>
+      </w:r>
+    </w:p>
+    <w:p>
+      <w:pPr>
+        <w:pStyle w:val="Normal"/>
+        <w:bidi w:val="0"/>
+        <w:jc w:val="left"/>
+        <w:rPr/>
+      </w:pPr>
+      <w:r>
+        <w:rPr/>
+        <w:t>--- Personal nos ---</w:t>
+      </w:r>
+    </w:p>
+    <w:p>
+      <w:pPr>
+        <w:pStyle w:val="Normal"/>
+        <w:bidi w:val="0"/>
+        <w:jc w:val="left"/>
+        <w:rPr/>
+      </w:pPr>
+      <w:r>
+        <w:rPr/>
+        <w:t>--- Personal vos ---</w:t>
+      </w:r>
+    </w:p>
+    <w:p>
+      <w:pPr>
+        <w:pStyle w:val="Normal"/>
+        <w:bidi w:val="0"/>
+        <w:jc w:val="left"/>
+        <w:rPr/>
+      </w:pPr>
+      <w:r>
+        <w:rPr/>
+        <w:t>--- Personal ei, eae, ea ---</w:t>
+      </w:r>
+    </w:p>
+    <w:p>
+      <w:pPr>
+        <w:pStyle w:val="Normal"/>
+        <w:bidi w:val="0"/>
+        <w:jc w:val="left"/>
+        <w:rPr/>
+      </w:pPr>
+      <w:r>
+        <w:rPr/>
+        <w:t>--- Reflexive sui ---</w:t>
+      </w:r>
+    </w:p>
+    <w:p>
+      <w:pPr>
+        <w:pStyle w:val="Normal"/>
+        <w:bidi w:val="0"/>
+        <w:jc w:val="left"/>
+        <w:rPr/>
+      </w:pPr>
+      <w:r>
+        <w:rPr/>
+        <w:t>--- Demonstrative hic, haec, hoc ---</w:t>
+      </w:r>
+    </w:p>
+    <w:p>
+      <w:pPr>
+        <w:pStyle w:val="Normal"/>
+        <w:bidi w:val="0"/>
+        <w:jc w:val="left"/>
+        <w:rPr/>
+      </w:pPr>
+      <w:r>
+        <w:rPr/>
+        <w:t>--- Demonstrative ille, illa, illud ---</w:t>
+      </w:r>
+    </w:p>
+    <w:p>
+      <w:pPr>
+        <w:pStyle w:val="Normal"/>
+        <w:bidi w:val="0"/>
+        <w:jc w:val="left"/>
+        <w:rPr/>
+      </w:pPr>
+      <w:r>
+        <w:rPr/>
+        <w:t>--- Demonstrative iste, ista, istud ---</w:t>
+      </w:r>
+    </w:p>
+    <w:p>
+      <w:pPr>
+        <w:pStyle w:val="Normal"/>
+        <w:bidi w:val="0"/>
+        <w:jc w:val="left"/>
+        <w:rPr/>
+      </w:pPr>
+      <w:r>
+        <w:rPr/>
+        <w:t>--- Intensive ipse, ipsa, ipsum ---</w:t>
+      </w:r>
+    </w:p>
+    <w:p>
+      <w:pPr>
+        <w:pStyle w:val="Normal"/>
+        <w:bidi w:val="0"/>
+        <w:jc w:val="left"/>
+        <w:rPr/>
+      </w:pPr>
+      <w:r>
+        <w:rPr/>
+        <w:t>--- Relative qui, quae, quod ---</w:t>
+      </w:r>
+    </w:p>
+    <w:p>
+      <w:pPr>
+        <w:pStyle w:val="Normal"/>
+        <w:bidi w:val="0"/>
+        <w:jc w:val="left"/>
+        <w:rPr/>
+      </w:pPr>
+      <w:r>
+        <w:rPr/>
+        <w:t>--- Interrogative quis, quid ---</w:t>
+      </w:r>
+    </w:p>
+    <w:p>
+      <w:pPr>
+        <w:pStyle w:val="Normal"/>
+        <w:bidi w:val="0"/>
+        <w:jc w:val="left"/>
+        <w:rPr/>
+      </w:pPr>
+      <w:r>
+        <w:rPr/>
+      </w:r>
+    </w:p>
+    <w:p>
+      <w:pPr>
+        <w:pStyle w:val="Normal"/>
+        <w:bidi w:val="0"/>
+        <w:jc w:val="left"/>
+        <w:rPr/>
+      </w:pPr>
+      <w:r>
+        <w:rPr/>
         <w:t>--- Personal ---</w:t>
       </w:r>
     </w:p>
@@ -2187,160 +3474,6 @@
       </w:pPr>
       <w:r>
         <w:rPr/>
-      </w:r>
-    </w:p>
-    <w:p>
-      <w:pPr>
-        <w:pStyle w:val="Normal"/>
-        <w:bidi w:val="0"/>
-        <w:jc w:val="left"/>
-        <w:rPr/>
-      </w:pPr>
-      <w:r>
-        <w:rPr/>
-      </w:r>
-    </w:p>
-    <w:p>
-      <w:pPr>
-        <w:pStyle w:val="Normal"/>
-        <w:bidi w:val="0"/>
-        <w:jc w:val="left"/>
-        <w:rPr/>
-      </w:pPr>
-      <w:r>
-        <w:rPr/>
-      </w:r>
-    </w:p>
-    <w:p>
-      <w:pPr>
-        <w:pStyle w:val="Normal"/>
-        <w:bidi w:val="0"/>
-        <w:jc w:val="left"/>
-        <w:rPr/>
-      </w:pPr>
-      <w:r>
-        <w:rPr/>
-      </w:r>
-    </w:p>
-    <w:p>
-      <w:pPr>
-        <w:pStyle w:val="Normal"/>
-        <w:bidi w:val="0"/>
-        <w:jc w:val="left"/>
-        <w:rPr/>
-      </w:pPr>
-      <w:r>
-        <w:rPr/>
-      </w:r>
-    </w:p>
-    <w:p>
-      <w:pPr>
-        <w:pStyle w:val="Normal"/>
-        <w:bidi w:val="0"/>
-        <w:jc w:val="left"/>
-        <w:rPr/>
-      </w:pPr>
-      <w:r>
-        <w:rPr/>
-      </w:r>
-    </w:p>
-    <w:p>
-      <w:pPr>
-        <w:pStyle w:val="Normal"/>
-        <w:bidi w:val="0"/>
-        <w:jc w:val="left"/>
-        <w:rPr/>
-      </w:pPr>
-      <w:r>
-        <w:rPr/>
-      </w:r>
-    </w:p>
-    <w:p>
-      <w:pPr>
-        <w:pStyle w:val="Normal"/>
-        <w:bidi w:val="0"/>
-        <w:jc w:val="left"/>
-        <w:rPr/>
-      </w:pPr>
-      <w:r>
-        <w:rPr/>
-      </w:r>
-    </w:p>
-    <w:p>
-      <w:pPr>
-        <w:pStyle w:val="Normal"/>
-        <w:bidi w:val="0"/>
-        <w:jc w:val="left"/>
-        <w:rPr/>
-      </w:pPr>
-      <w:r>
-        <w:rPr/>
-      </w:r>
-    </w:p>
-    <w:p>
-      <w:pPr>
-        <w:pStyle w:val="Normal"/>
-        <w:bidi w:val="0"/>
-        <w:jc w:val="left"/>
-        <w:rPr/>
-      </w:pPr>
-      <w:r>
-        <w:rPr/>
-      </w:r>
-    </w:p>
-    <w:p>
-      <w:pPr>
-        <w:pStyle w:val="Normal"/>
-        <w:bidi w:val="0"/>
-        <w:jc w:val="left"/>
-        <w:rPr/>
-      </w:pPr>
-      <w:r>
-        <w:rPr/>
-      </w:r>
-    </w:p>
-    <w:p>
-      <w:pPr>
-        <w:pStyle w:val="Normal"/>
-        <w:bidi w:val="0"/>
-        <w:jc w:val="left"/>
-        <w:rPr/>
-      </w:pPr>
-      <w:r>
-        <w:rPr/>
-      </w:r>
-    </w:p>
-    <w:p>
-      <w:pPr>
-        <w:pStyle w:val="Normal"/>
-        <w:bidi w:val="0"/>
-        <w:jc w:val="left"/>
-        <w:rPr/>
-      </w:pPr>
-      <w:r>
-        <w:rPr/>
-      </w:r>
-    </w:p>
-    <w:p>
-      <w:pPr>
-        <w:pStyle w:val="Normal"/>
-        <w:bidi w:val="0"/>
-        <w:jc w:val="left"/>
-        <w:rPr/>
-      </w:pPr>
-      <w:r>
-        <w:rPr/>
-      </w:r>
-    </w:p>
-    <w:p>
-      <w:pPr>
-        <w:pStyle w:val="Normal"/>
-        <w:bidi w:val="0"/>
-        <w:jc w:val="left"/>
-        <w:rPr/>
-      </w:pPr>
-      <w:r>
-        <w:rPr/>
         <w:t>=== Verb sum ===</w:t>
       </w:r>
     </w:p>
@@ -2364,6 +3497,29 @@
       </w:pPr>
       <w:r>
         <w:rPr/>
+        <w:t>--- sum, esse, fui ---</w:t>
+      </w:r>
+    </w:p>
+    <w:p>
+      <w:pPr>
+        <w:pStyle w:val="Normal"/>
+        <w:bidi w:val="0"/>
+        <w:jc w:val="left"/>
+        <w:rPr/>
+      </w:pPr>
+      <w:r>
+        <w:rPr/>
+      </w:r>
+    </w:p>
+    <w:p>
+      <w:pPr>
+        <w:pStyle w:val="Normal"/>
+        <w:bidi w:val="0"/>
+        <w:jc w:val="left"/>
+        <w:rPr/>
+      </w:pPr>
+      <w:r>
+        <w:rPr/>
         <w:t>--- Present Indicative ---</w:t>
       </w:r>
     </w:p>
@@ -2894,28 +4050,6 @@
       </w:pPr>
       <w:r>
         <w:rPr/>
-      </w:r>
-    </w:p>
-    <w:p>
-      <w:pPr>
-        <w:pStyle w:val="Normal"/>
-        <w:bidi w:val="0"/>
-        <w:jc w:val="left"/>
-        <w:rPr/>
-      </w:pPr>
-      <w:r>
-        <w:rPr/>
-      </w:r>
-    </w:p>
-    <w:p>
-      <w:pPr>
-        <w:pStyle w:val="Normal"/>
-        <w:bidi w:val="0"/>
-        <w:jc w:val="left"/>
-        <w:rPr/>
-      </w:pPr>
-      <w:r>
-        <w:rPr/>
         <w:t>=== Verbs, Indicative Active ===</w:t>
       </w:r>
     </w:p>
@@ -2939,6 +4073,77 @@
       </w:pPr>
       <w:r>
         <w:rPr/>
+        <w:t>--- 1-st conj. laudo, are, avi, atum ---</w:t>
+      </w:r>
+    </w:p>
+    <w:p>
+      <w:pPr>
+        <w:pStyle w:val="Normal"/>
+        <w:bidi w:val="0"/>
+        <w:jc w:val="left"/>
+        <w:rPr/>
+      </w:pPr>
+      <w:r>
+        <w:rPr/>
+        <w:t>--- 2-nd conj.  moneo, ere, ui, itum ---</w:t>
+      </w:r>
+    </w:p>
+    <w:p>
+      <w:pPr>
+        <w:pStyle w:val="Normal"/>
+        <w:bidi w:val="0"/>
+        <w:jc w:val="left"/>
+        <w:rPr/>
+      </w:pPr>
+      <w:r>
+        <w:rPr/>
+        <w:t>--- 3-rd conj. duco, ere, duxi, ductum ---</w:t>
+      </w:r>
+    </w:p>
+    <w:p>
+      <w:pPr>
+        <w:pStyle w:val="Normal"/>
+        <w:bidi w:val="0"/>
+        <w:jc w:val="left"/>
+        <w:rPr/>
+      </w:pPr>
+      <w:r>
+        <w:rPr/>
+        <w:t>--- 4-th conj. audio, ire, ivi, itum ---</w:t>
+      </w:r>
+    </w:p>
+    <w:p>
+      <w:pPr>
+        <w:pStyle w:val="Normal"/>
+        <w:bidi w:val="0"/>
+        <w:jc w:val="left"/>
+        <w:rPr/>
+      </w:pPr>
+      <w:r>
+        <w:rPr/>
+        <w:t>--- 3-rd conj. with stem in -i capio, ere, cepi, captum ---</w:t>
+      </w:r>
+    </w:p>
+    <w:p>
+      <w:pPr>
+        <w:pStyle w:val="Normal"/>
+        <w:bidi w:val="0"/>
+        <w:jc w:val="left"/>
+        <w:rPr/>
+      </w:pPr>
+      <w:r>
+        <w:rPr/>
+      </w:r>
+    </w:p>
+    <w:p>
+      <w:pPr>
+        <w:pStyle w:val="Normal"/>
+        <w:bidi w:val="0"/>
+        <w:jc w:val="left"/>
+        <w:rPr/>
+      </w:pPr>
+      <w:r>
+        <w:rPr/>
         <w:t>--- Present ---</w:t>
       </w:r>
     </w:p>
@@ -3437,72 +4642,6 @@
       </w:pPr>
       <w:r>
         <w:rPr/>
-      </w:r>
-    </w:p>
-    <w:p>
-      <w:pPr>
-        <w:pStyle w:val="Normal"/>
-        <w:bidi w:val="0"/>
-        <w:jc w:val="left"/>
-        <w:rPr/>
-      </w:pPr>
-      <w:r>
-        <w:rPr/>
-      </w:r>
-    </w:p>
-    <w:p>
-      <w:pPr>
-        <w:pStyle w:val="Normal"/>
-        <w:bidi w:val="0"/>
-        <w:jc w:val="left"/>
-        <w:rPr/>
-      </w:pPr>
-      <w:r>
-        <w:rPr/>
-      </w:r>
-    </w:p>
-    <w:p>
-      <w:pPr>
-        <w:pStyle w:val="Normal"/>
-        <w:bidi w:val="0"/>
-        <w:jc w:val="left"/>
-        <w:rPr/>
-      </w:pPr>
-      <w:r>
-        <w:rPr/>
-      </w:r>
-    </w:p>
-    <w:p>
-      <w:pPr>
-        <w:pStyle w:val="Normal"/>
-        <w:bidi w:val="0"/>
-        <w:jc w:val="left"/>
-        <w:rPr/>
-      </w:pPr>
-      <w:r>
-        <w:rPr/>
-      </w:r>
-    </w:p>
-    <w:p>
-      <w:pPr>
-        <w:pStyle w:val="Normal"/>
-        <w:bidi w:val="0"/>
-        <w:jc w:val="left"/>
-        <w:rPr/>
-      </w:pPr>
-      <w:r>
-        <w:rPr/>
-      </w:r>
-    </w:p>
-    <w:p>
-      <w:pPr>
-        <w:pStyle w:val="Normal"/>
-        <w:bidi w:val="0"/>
-        <w:jc w:val="left"/>
-        <w:rPr/>
-      </w:pPr>
-      <w:r>
-        <w:rPr/>
         <w:t>=== Verbs, Indicative Passive ===</w:t>
       </w:r>
     </w:p>
@@ -3526,6 +4665,77 @@
       </w:pPr>
       <w:r>
         <w:rPr/>
+        <w:t>--- 1-st conj. laudo, are, avi, atum ---</w:t>
+      </w:r>
+    </w:p>
+    <w:p>
+      <w:pPr>
+        <w:pStyle w:val="Normal"/>
+        <w:bidi w:val="0"/>
+        <w:jc w:val="left"/>
+        <w:rPr/>
+      </w:pPr>
+      <w:r>
+        <w:rPr/>
+        <w:t>--- 2-nd conj.  moneo, ere, ui, itum ---</w:t>
+      </w:r>
+    </w:p>
+    <w:p>
+      <w:pPr>
+        <w:pStyle w:val="Normal"/>
+        <w:bidi w:val="0"/>
+        <w:jc w:val="left"/>
+        <w:rPr/>
+      </w:pPr>
+      <w:r>
+        <w:rPr/>
+        <w:t>--- 3-rd conj. duco, ere, duxi, ductum ---</w:t>
+      </w:r>
+    </w:p>
+    <w:p>
+      <w:pPr>
+        <w:pStyle w:val="Normal"/>
+        <w:bidi w:val="0"/>
+        <w:jc w:val="left"/>
+        <w:rPr/>
+      </w:pPr>
+      <w:r>
+        <w:rPr/>
+        <w:t>--- 4-th conj. audio, ire, ivi, itum ---</w:t>
+      </w:r>
+    </w:p>
+    <w:p>
+      <w:pPr>
+        <w:pStyle w:val="Normal"/>
+        <w:bidi w:val="0"/>
+        <w:jc w:val="left"/>
+        <w:rPr/>
+      </w:pPr>
+      <w:r>
+        <w:rPr/>
+        <w:t>--- 3-rd conj. with stem in -i capio, ere, cepi, captum ---</w:t>
+      </w:r>
+    </w:p>
+    <w:p>
+      <w:pPr>
+        <w:pStyle w:val="Normal"/>
+        <w:bidi w:val="0"/>
+        <w:jc w:val="left"/>
+        <w:rPr/>
+      </w:pPr>
+      <w:r>
+        <w:rPr/>
+      </w:r>
+    </w:p>
+    <w:p>
+      <w:pPr>
+        <w:pStyle w:val="Normal"/>
+        <w:bidi w:val="0"/>
+        <w:jc w:val="left"/>
+        <w:rPr/>
+      </w:pPr>
+      <w:r>
+        <w:rPr/>
         <w:t>--- Present ---</w:t>
       </w:r>
     </w:p>
@@ -4024,72 +5234,6 @@
       </w:pPr>
       <w:r>
         <w:rPr/>
-      </w:r>
-    </w:p>
-    <w:p>
-      <w:pPr>
-        <w:pStyle w:val="Normal"/>
-        <w:bidi w:val="0"/>
-        <w:jc w:val="left"/>
-        <w:rPr/>
-      </w:pPr>
-      <w:r>
-        <w:rPr/>
-      </w:r>
-    </w:p>
-    <w:p>
-      <w:pPr>
-        <w:pStyle w:val="Normal"/>
-        <w:bidi w:val="0"/>
-        <w:jc w:val="left"/>
-        <w:rPr/>
-      </w:pPr>
-      <w:r>
-        <w:rPr/>
-      </w:r>
-    </w:p>
-    <w:p>
-      <w:pPr>
-        <w:pStyle w:val="Normal"/>
-        <w:bidi w:val="0"/>
-        <w:jc w:val="left"/>
-        <w:rPr/>
-      </w:pPr>
-      <w:r>
-        <w:rPr/>
-      </w:r>
-    </w:p>
-    <w:p>
-      <w:pPr>
-        <w:pStyle w:val="Normal"/>
-        <w:bidi w:val="0"/>
-        <w:jc w:val="left"/>
-        <w:rPr/>
-      </w:pPr>
-      <w:r>
-        <w:rPr/>
-      </w:r>
-    </w:p>
-    <w:p>
-      <w:pPr>
-        <w:pStyle w:val="Normal"/>
-        <w:bidi w:val="0"/>
-        <w:jc w:val="left"/>
-        <w:rPr/>
-      </w:pPr>
-      <w:r>
-        <w:rPr/>
-      </w:r>
-    </w:p>
-    <w:p>
-      <w:pPr>
-        <w:pStyle w:val="Normal"/>
-        <w:bidi w:val="0"/>
-        <w:jc w:val="left"/>
-        <w:rPr/>
-      </w:pPr>
-      <w:r>
-        <w:rPr/>
         <w:t>=== Verbs, Subjunctive Active ===</w:t>
       </w:r>
     </w:p>
@@ -4113,6 +5257,77 @@
       </w:pPr>
       <w:r>
         <w:rPr/>
+        <w:t>--- 1-st conj. laudo, are, avi, atum ---</w:t>
+      </w:r>
+    </w:p>
+    <w:p>
+      <w:pPr>
+        <w:pStyle w:val="Normal"/>
+        <w:bidi w:val="0"/>
+        <w:jc w:val="left"/>
+        <w:rPr/>
+      </w:pPr>
+      <w:r>
+        <w:rPr/>
+        <w:t>--- 2-nd conj.  moneo, ere, ui, itum ---</w:t>
+      </w:r>
+    </w:p>
+    <w:p>
+      <w:pPr>
+        <w:pStyle w:val="Normal"/>
+        <w:bidi w:val="0"/>
+        <w:jc w:val="left"/>
+        <w:rPr/>
+      </w:pPr>
+      <w:r>
+        <w:rPr/>
+        <w:t>--- 3-rd conj. duco, ere, duxi, ductum ---</w:t>
+      </w:r>
+    </w:p>
+    <w:p>
+      <w:pPr>
+        <w:pStyle w:val="Normal"/>
+        <w:bidi w:val="0"/>
+        <w:jc w:val="left"/>
+        <w:rPr/>
+      </w:pPr>
+      <w:r>
+        <w:rPr/>
+        <w:t>--- 4-th conj. audio, ire, ivi, itum ---</w:t>
+      </w:r>
+    </w:p>
+    <w:p>
+      <w:pPr>
+        <w:pStyle w:val="Normal"/>
+        <w:bidi w:val="0"/>
+        <w:jc w:val="left"/>
+        <w:rPr/>
+      </w:pPr>
+      <w:r>
+        <w:rPr/>
+        <w:t>--- 3-rd conj. with stem in -i capio, ere, cepi, captum ---</w:t>
+      </w:r>
+    </w:p>
+    <w:p>
+      <w:pPr>
+        <w:pStyle w:val="Normal"/>
+        <w:bidi w:val="0"/>
+        <w:jc w:val="left"/>
+        <w:rPr/>
+      </w:pPr>
+      <w:r>
+        <w:rPr/>
+      </w:r>
+    </w:p>
+    <w:p>
+      <w:pPr>
+        <w:pStyle w:val="Normal"/>
+        <w:bidi w:val="0"/>
+        <w:jc w:val="left"/>
+        <w:rPr/>
+      </w:pPr>
+      <w:r>
+        <w:rPr/>
         <w:t>--- Present ---</w:t>
       </w:r>
     </w:p>
@@ -4599,72 +5814,6 @@
       </w:pPr>
       <w:r>
         <w:rPr/>
-      </w:r>
-    </w:p>
-    <w:p>
-      <w:pPr>
-        <w:pStyle w:val="Normal"/>
-        <w:bidi w:val="0"/>
-        <w:jc w:val="left"/>
-        <w:rPr/>
-      </w:pPr>
-      <w:r>
-        <w:rPr/>
-      </w:r>
-    </w:p>
-    <w:p>
-      <w:pPr>
-        <w:pStyle w:val="Normal"/>
-        <w:bidi w:val="0"/>
-        <w:jc w:val="left"/>
-        <w:rPr/>
-      </w:pPr>
-      <w:r>
-        <w:rPr/>
-      </w:r>
-    </w:p>
-    <w:p>
-      <w:pPr>
-        <w:pStyle w:val="Normal"/>
-        <w:bidi w:val="0"/>
-        <w:jc w:val="left"/>
-        <w:rPr/>
-      </w:pPr>
-      <w:r>
-        <w:rPr/>
-      </w:r>
-    </w:p>
-    <w:p>
-      <w:pPr>
-        <w:pStyle w:val="Normal"/>
-        <w:bidi w:val="0"/>
-        <w:jc w:val="left"/>
-        <w:rPr/>
-      </w:pPr>
-      <w:r>
-        <w:rPr/>
-      </w:r>
-    </w:p>
-    <w:p>
-      <w:pPr>
-        <w:pStyle w:val="Normal"/>
-        <w:bidi w:val="0"/>
-        <w:jc w:val="left"/>
-        <w:rPr/>
-      </w:pPr>
-      <w:r>
-        <w:rPr/>
-      </w:r>
-    </w:p>
-    <w:p>
-      <w:pPr>
-        <w:pStyle w:val="Normal"/>
-        <w:bidi w:val="0"/>
-        <w:jc w:val="left"/>
-        <w:rPr/>
-      </w:pPr>
-      <w:r>
-        <w:rPr/>
         <w:t>=== Verbs, Subjunctive Passive ===</w:t>
       </w:r>
     </w:p>
@@ -4688,6 +5837,77 @@
       </w:pPr>
       <w:r>
         <w:rPr/>
+        <w:t>--- 1-st conj. laudo, are, avi, atum ---</w:t>
+      </w:r>
+    </w:p>
+    <w:p>
+      <w:pPr>
+        <w:pStyle w:val="Normal"/>
+        <w:bidi w:val="0"/>
+        <w:jc w:val="left"/>
+        <w:rPr/>
+      </w:pPr>
+      <w:r>
+        <w:rPr/>
+        <w:t>--- 2-nd conj.  moneo, ere, ui, itum ---</w:t>
+      </w:r>
+    </w:p>
+    <w:p>
+      <w:pPr>
+        <w:pStyle w:val="Normal"/>
+        <w:bidi w:val="0"/>
+        <w:jc w:val="left"/>
+        <w:rPr/>
+      </w:pPr>
+      <w:r>
+        <w:rPr/>
+        <w:t>--- 3-rd conj. duco, ere, duxi, ductum ---</w:t>
+      </w:r>
+    </w:p>
+    <w:p>
+      <w:pPr>
+        <w:pStyle w:val="Normal"/>
+        <w:bidi w:val="0"/>
+        <w:jc w:val="left"/>
+        <w:rPr/>
+      </w:pPr>
+      <w:r>
+        <w:rPr/>
+        <w:t>--- 4-th conj. audio, ire, ivi, itum ---</w:t>
+      </w:r>
+    </w:p>
+    <w:p>
+      <w:pPr>
+        <w:pStyle w:val="Normal"/>
+        <w:bidi w:val="0"/>
+        <w:jc w:val="left"/>
+        <w:rPr/>
+      </w:pPr>
+      <w:r>
+        <w:rPr/>
+        <w:t>--- 3-rd conj. with stem in -i capio, ere, cepi, captum ---</w:t>
+      </w:r>
+    </w:p>
+    <w:p>
+      <w:pPr>
+        <w:pStyle w:val="Normal"/>
+        <w:bidi w:val="0"/>
+        <w:jc w:val="left"/>
+        <w:rPr/>
+      </w:pPr>
+      <w:r>
+        <w:rPr/>
+      </w:r>
+    </w:p>
+    <w:p>
+      <w:pPr>
+        <w:pStyle w:val="Normal"/>
+        <w:bidi w:val="0"/>
+        <w:jc w:val="left"/>
+        <w:rPr/>
+      </w:pPr>
+      <w:r>
+        <w:rPr/>
         <w:t>--- Present ---</w:t>
       </w:r>
     </w:p>
@@ -5174,72 +6394,6 @@
       </w:pPr>
       <w:r>
         <w:rPr/>
-      </w:r>
-    </w:p>
-    <w:p>
-      <w:pPr>
-        <w:pStyle w:val="Normal"/>
-        <w:bidi w:val="0"/>
-        <w:jc w:val="left"/>
-        <w:rPr/>
-      </w:pPr>
-      <w:r>
-        <w:rPr/>
-      </w:r>
-    </w:p>
-    <w:p>
-      <w:pPr>
-        <w:pStyle w:val="Normal"/>
-        <w:bidi w:val="0"/>
-        <w:jc w:val="left"/>
-        <w:rPr/>
-      </w:pPr>
-      <w:r>
-        <w:rPr/>
-      </w:r>
-    </w:p>
-    <w:p>
-      <w:pPr>
-        <w:pStyle w:val="Normal"/>
-        <w:bidi w:val="0"/>
-        <w:jc w:val="left"/>
-        <w:rPr/>
-      </w:pPr>
-      <w:r>
-        <w:rPr/>
-      </w:r>
-    </w:p>
-    <w:p>
-      <w:pPr>
-        <w:pStyle w:val="Normal"/>
-        <w:bidi w:val="0"/>
-        <w:jc w:val="left"/>
-        <w:rPr/>
-      </w:pPr>
-      <w:r>
-        <w:rPr/>
-      </w:r>
-    </w:p>
-    <w:p>
-      <w:pPr>
-        <w:pStyle w:val="Normal"/>
-        <w:bidi w:val="0"/>
-        <w:jc w:val="left"/>
-        <w:rPr/>
-      </w:pPr>
-      <w:r>
-        <w:rPr/>
-      </w:r>
-    </w:p>
-    <w:p>
-      <w:pPr>
-        <w:pStyle w:val="Normal"/>
-        <w:bidi w:val="0"/>
-        <w:jc w:val="left"/>
-        <w:rPr/>
-      </w:pPr>
-      <w:r>
-        <w:rPr/>
         <w:t>=== Verbs, Imperative ===</w:t>
       </w:r>
     </w:p>
@@ -5263,6 +6417,77 @@
       </w:pPr>
       <w:r>
         <w:rPr/>
+        <w:t>--- 1-st conj. laudo, are, avi, atum ---</w:t>
+      </w:r>
+    </w:p>
+    <w:p>
+      <w:pPr>
+        <w:pStyle w:val="Normal"/>
+        <w:bidi w:val="0"/>
+        <w:jc w:val="left"/>
+        <w:rPr/>
+      </w:pPr>
+      <w:r>
+        <w:rPr/>
+        <w:t>--- 2-nd conj. moneo, ere, ui, itum ---</w:t>
+      </w:r>
+    </w:p>
+    <w:p>
+      <w:pPr>
+        <w:pStyle w:val="Normal"/>
+        <w:bidi w:val="0"/>
+        <w:jc w:val="left"/>
+        <w:rPr/>
+      </w:pPr>
+      <w:r>
+        <w:rPr/>
+        <w:t>--- 3-rd conj. duco, ere, duxi, ductum ---</w:t>
+      </w:r>
+    </w:p>
+    <w:p>
+      <w:pPr>
+        <w:pStyle w:val="Normal"/>
+        <w:bidi w:val="0"/>
+        <w:jc w:val="left"/>
+        <w:rPr/>
+      </w:pPr>
+      <w:r>
+        <w:rPr/>
+        <w:t>--- 4-th conj. audio, ire, ivi, itum ---</w:t>
+      </w:r>
+    </w:p>
+    <w:p>
+      <w:pPr>
+        <w:pStyle w:val="Normal"/>
+        <w:bidi w:val="0"/>
+        <w:jc w:val="left"/>
+        <w:rPr/>
+      </w:pPr>
+      <w:r>
+        <w:rPr/>
+        <w:t>--- 3-rd conj. with stem in -i capio, ere, cepi, captum ---</w:t>
+      </w:r>
+    </w:p>
+    <w:p>
+      <w:pPr>
+        <w:pStyle w:val="Normal"/>
+        <w:bidi w:val="0"/>
+        <w:jc w:val="left"/>
+        <w:rPr/>
+      </w:pPr>
+      <w:r>
+        <w:rPr/>
+      </w:r>
+    </w:p>
+    <w:p>
+      <w:pPr>
+        <w:pStyle w:val="Normal"/>
+        <w:bidi w:val="0"/>
+        <w:jc w:val="left"/>
+        <w:rPr/>
+      </w:pPr>
+      <w:r>
+        <w:rPr/>
         <w:t>--- Present Active ---</w:t>
       </w:r>
     </w:p>
@@ -5749,72 +6974,6 @@
       </w:pPr>
       <w:r>
         <w:rPr/>
-      </w:r>
-    </w:p>
-    <w:p>
-      <w:pPr>
-        <w:pStyle w:val="Normal"/>
-        <w:bidi w:val="0"/>
-        <w:jc w:val="left"/>
-        <w:rPr/>
-      </w:pPr>
-      <w:r>
-        <w:rPr/>
-      </w:r>
-    </w:p>
-    <w:p>
-      <w:pPr>
-        <w:pStyle w:val="Normal"/>
-        <w:bidi w:val="0"/>
-        <w:jc w:val="left"/>
-        <w:rPr/>
-      </w:pPr>
-      <w:r>
-        <w:rPr/>
-      </w:r>
-    </w:p>
-    <w:p>
-      <w:pPr>
-        <w:pStyle w:val="Normal"/>
-        <w:bidi w:val="0"/>
-        <w:jc w:val="left"/>
-        <w:rPr/>
-      </w:pPr>
-      <w:r>
-        <w:rPr/>
-      </w:r>
-    </w:p>
-    <w:p>
-      <w:pPr>
-        <w:pStyle w:val="Normal"/>
-        <w:bidi w:val="0"/>
-        <w:jc w:val="left"/>
-        <w:rPr/>
-      </w:pPr>
-      <w:r>
-        <w:rPr/>
-      </w:r>
-    </w:p>
-    <w:p>
-      <w:pPr>
-        <w:pStyle w:val="Normal"/>
-        <w:bidi w:val="0"/>
-        <w:jc w:val="left"/>
-        <w:rPr/>
-      </w:pPr>
-      <w:r>
-        <w:rPr/>
-      </w:r>
-    </w:p>
-    <w:p>
-      <w:pPr>
-        <w:pStyle w:val="Normal"/>
-        <w:bidi w:val="0"/>
-        <w:jc w:val="left"/>
-        <w:rPr/>
-      </w:pPr>
-      <w:r>
-        <w:rPr/>
         <w:t>=== Verbs, nonfinite ===</w:t>
       </w:r>
     </w:p>
@@ -5838,6 +6997,77 @@
       </w:pPr>
       <w:r>
         <w:rPr/>
+        <w:t>--- 1-st conj. laudo, are, avi, atum ---</w:t>
+      </w:r>
+    </w:p>
+    <w:p>
+      <w:pPr>
+        <w:pStyle w:val="Normal"/>
+        <w:bidi w:val="0"/>
+        <w:jc w:val="left"/>
+        <w:rPr/>
+      </w:pPr>
+      <w:r>
+        <w:rPr/>
+        <w:t>--- 2-nd conj.  moneo, ere, ui, itum ---</w:t>
+      </w:r>
+    </w:p>
+    <w:p>
+      <w:pPr>
+        <w:pStyle w:val="Normal"/>
+        <w:bidi w:val="0"/>
+        <w:jc w:val="left"/>
+        <w:rPr/>
+      </w:pPr>
+      <w:r>
+        <w:rPr/>
+        <w:t>--- 3-rd conj. duco, ere, duxi, ductum ---</w:t>
+      </w:r>
+    </w:p>
+    <w:p>
+      <w:pPr>
+        <w:pStyle w:val="Normal"/>
+        <w:bidi w:val="0"/>
+        <w:jc w:val="left"/>
+        <w:rPr/>
+      </w:pPr>
+      <w:r>
+        <w:rPr/>
+        <w:t>--- 4-th conj. audio, ire, ivi, itum ---</w:t>
+      </w:r>
+    </w:p>
+    <w:p>
+      <w:pPr>
+        <w:pStyle w:val="Normal"/>
+        <w:bidi w:val="0"/>
+        <w:jc w:val="left"/>
+        <w:rPr/>
+      </w:pPr>
+      <w:r>
+        <w:rPr/>
+        <w:t>--- 3-rd conj. with stem in -i capio, ere, cepi, captum ---</w:t>
+      </w:r>
+    </w:p>
+    <w:p>
+      <w:pPr>
+        <w:pStyle w:val="Normal"/>
+        <w:bidi w:val="0"/>
+        <w:jc w:val="left"/>
+        <w:rPr/>
+      </w:pPr>
+      <w:r>
+        <w:rPr/>
+      </w:r>
+    </w:p>
+    <w:p>
+      <w:pPr>
+        <w:pStyle w:val="Normal"/>
+        <w:bidi w:val="0"/>
+        <w:jc w:val="left"/>
+        <w:rPr/>
+      </w:pPr>
+      <w:r>
+        <w:rPr/>
         <w:t>--- INFINITIVE ---</w:t>
       </w:r>
     </w:p>
@@ -6858,72 +8088,6 @@
       <w:r>
         <w:rPr/>
         <w:t>Take: captum captu</w:t>
-      </w:r>
-    </w:p>
-    <w:p>
-      <w:pPr>
-        <w:pStyle w:val="Normal"/>
-        <w:bidi w:val="0"/>
-        <w:jc w:val="left"/>
-        <w:rPr/>
-      </w:pPr>
-      <w:r>
-        <w:rPr/>
-      </w:r>
-    </w:p>
-    <w:p>
-      <w:pPr>
-        <w:pStyle w:val="Normal"/>
-        <w:bidi w:val="0"/>
-        <w:jc w:val="left"/>
-        <w:rPr/>
-      </w:pPr>
-      <w:r>
-        <w:rPr/>
-      </w:r>
-    </w:p>
-    <w:p>
-      <w:pPr>
-        <w:pStyle w:val="Normal"/>
-        <w:bidi w:val="0"/>
-        <w:jc w:val="left"/>
-        <w:rPr/>
-      </w:pPr>
-      <w:r>
-        <w:rPr/>
-      </w:r>
-    </w:p>
-    <w:p>
-      <w:pPr>
-        <w:pStyle w:val="Normal"/>
-        <w:bidi w:val="0"/>
-        <w:jc w:val="left"/>
-        <w:rPr/>
-      </w:pPr>
-      <w:r>
-        <w:rPr/>
-      </w:r>
-    </w:p>
-    <w:p>
-      <w:pPr>
-        <w:pStyle w:val="Normal"/>
-        <w:bidi w:val="0"/>
-        <w:jc w:val="left"/>
-        <w:rPr/>
-      </w:pPr>
-      <w:r>
-        <w:rPr/>
-      </w:r>
-    </w:p>
-    <w:p>
-      <w:pPr>
-        <w:pStyle w:val="Normal"/>
-        <w:bidi w:val="0"/>
-        <w:jc w:val="left"/>
-        <w:rPr/>
-      </w:pPr>
-      <w:r>
-        <w:rPr/>
       </w:r>
     </w:p>
     <w:p>

</xml_diff>

<commit_message>
[234] Correct table of verb "sum" in Latin drills
</commit_message>
<xml_diff>
--- a/site/drills/latin/answers.docx
+++ b/site/drills/latin/answers.docx
@@ -3486,17 +3486,6 @@
       </w:pPr>
       <w:r>
         <w:rPr/>
-      </w:r>
-    </w:p>
-    <w:p>
-      <w:pPr>
-        <w:pStyle w:val="Normal"/>
-        <w:bidi w:val="0"/>
-        <w:jc w:val="left"/>
-        <w:rPr/>
-      </w:pPr>
-      <w:r>
-        <w:rPr/>
         <w:t>--- sum, esse, fui ---</w:t>
       </w:r>
     </w:p>
@@ -3940,105 +3929,124 @@
       </w:pPr>
       <w:r>
         <w:rPr/>
-      </w:r>
-    </w:p>
-    <w:p>
-      <w:pPr>
-        <w:pStyle w:val="Normal"/>
-        <w:bidi w:val="0"/>
-        <w:jc w:val="left"/>
-        <w:rPr/>
-      </w:pPr>
-      <w:r>
-        <w:rPr/>
-      </w:r>
-    </w:p>
-    <w:p>
-      <w:pPr>
-        <w:pStyle w:val="Normal"/>
-        <w:bidi w:val="0"/>
-        <w:jc w:val="left"/>
-        <w:rPr/>
-      </w:pPr>
-      <w:r>
-        <w:rPr/>
-      </w:r>
-    </w:p>
-    <w:p>
-      <w:pPr>
-        <w:pStyle w:val="Normal"/>
-        <w:bidi w:val="0"/>
-        <w:jc w:val="left"/>
-        <w:rPr/>
-      </w:pPr>
-      <w:r>
-        <w:rPr/>
-      </w:r>
-    </w:p>
-    <w:p>
-      <w:pPr>
-        <w:pStyle w:val="Normal"/>
-        <w:bidi w:val="0"/>
-        <w:jc w:val="left"/>
-        <w:rPr/>
-      </w:pPr>
-      <w:r>
-        <w:rPr/>
-      </w:r>
-    </w:p>
-    <w:p>
-      <w:pPr>
-        <w:pStyle w:val="Normal"/>
-        <w:bidi w:val="0"/>
-        <w:jc w:val="left"/>
-        <w:rPr/>
-      </w:pPr>
-      <w:r>
-        <w:rPr/>
-      </w:r>
-    </w:p>
-    <w:p>
-      <w:pPr>
-        <w:pStyle w:val="Normal"/>
-        <w:bidi w:val="0"/>
-        <w:jc w:val="left"/>
-        <w:rPr/>
-      </w:pPr>
-      <w:r>
-        <w:rPr/>
-      </w:r>
-    </w:p>
-    <w:p>
-      <w:pPr>
-        <w:pStyle w:val="Normal"/>
-        <w:bidi w:val="0"/>
-        <w:jc w:val="left"/>
-        <w:rPr/>
-      </w:pPr>
-      <w:r>
-        <w:rPr/>
-      </w:r>
-    </w:p>
-    <w:p>
-      <w:pPr>
-        <w:pStyle w:val="Normal"/>
-        <w:bidi w:val="0"/>
-        <w:jc w:val="left"/>
-        <w:rPr/>
-      </w:pPr>
-      <w:r>
-        <w:rPr/>
-      </w:r>
-    </w:p>
-    <w:p>
-      <w:pPr>
-        <w:pStyle w:val="Normal"/>
-        <w:bidi w:val="0"/>
-        <w:jc w:val="left"/>
-        <w:rPr/>
-      </w:pPr>
-      <w:r>
-        <w:rPr/>
+        <w:t>--- Present Active Infinitive ---</w:t>
+      </w:r>
+    </w:p>
+    <w:p>
+      <w:pPr>
+        <w:pStyle w:val="Normal"/>
+        <w:bidi w:val="0"/>
+        <w:jc w:val="left"/>
+        <w:rPr/>
+      </w:pPr>
+      <w:r>
+        <w:rPr/>
+        <w:t>Be: esse</w:t>
+      </w:r>
+    </w:p>
+    <w:p>
+      <w:pPr>
+        <w:pStyle w:val="Normal"/>
+        <w:bidi w:val="0"/>
+        <w:jc w:val="left"/>
+        <w:rPr/>
+      </w:pPr>
+      <w:r>
+        <w:rPr/>
+      </w:r>
+    </w:p>
+    <w:p>
+      <w:pPr>
+        <w:pStyle w:val="Normal"/>
+        <w:bidi w:val="0"/>
+        <w:jc w:val="left"/>
+        <w:rPr/>
+      </w:pPr>
+      <w:r>
+        <w:rPr/>
+        <w:t>--- Perfect Active Infinitive ---</w:t>
+      </w:r>
+    </w:p>
+    <w:p>
+      <w:pPr>
+        <w:pStyle w:val="Normal"/>
+        <w:bidi w:val="0"/>
+        <w:jc w:val="left"/>
+        <w:rPr/>
+      </w:pPr>
+      <w:r>
+        <w:rPr/>
+        <w:t>Be: fuisse</w:t>
+      </w:r>
+    </w:p>
+    <w:p>
+      <w:pPr>
+        <w:pStyle w:val="Normal"/>
+        <w:bidi w:val="0"/>
+        <w:jc w:val="left"/>
+        <w:rPr/>
+      </w:pPr>
+      <w:r>
+        <w:rPr/>
+      </w:r>
+    </w:p>
+    <w:p>
+      <w:pPr>
+        <w:pStyle w:val="Normal"/>
+        <w:bidi w:val="0"/>
+        <w:jc w:val="left"/>
+        <w:rPr/>
+      </w:pPr>
+      <w:r>
+        <w:rPr/>
+        <w:t>--- Future Active Infinitive ---</w:t>
+      </w:r>
+    </w:p>
+    <w:p>
+      <w:pPr>
+        <w:pStyle w:val="Normal"/>
+        <w:bidi w:val="0"/>
+        <w:jc w:val="left"/>
+        <w:rPr/>
+      </w:pPr>
+      <w:r>
+        <w:rPr/>
+        <w:t>Be: futurus esse</w:t>
+      </w:r>
+    </w:p>
+    <w:p>
+      <w:pPr>
+        <w:pStyle w:val="Normal"/>
+        <w:bidi w:val="0"/>
+        <w:jc w:val="left"/>
+        <w:rPr/>
+      </w:pPr>
+      <w:r>
+        <w:rPr/>
+      </w:r>
+    </w:p>
+    <w:p>
+      <w:pPr>
+        <w:pStyle w:val="Normal"/>
+        <w:bidi w:val="0"/>
+        <w:jc w:val="left"/>
+        <w:rPr/>
+      </w:pPr>
+      <w:r>
+        <w:rPr/>
+        <w:t>--- Future Active Participle ---</w:t>
+      </w:r>
+    </w:p>
+    <w:p>
+      <w:pPr>
+        <w:pStyle w:val="Normal"/>
+        <w:bidi w:val="0"/>
+        <w:jc w:val="left"/>
+        <w:rPr/>
+      </w:pPr>
+      <w:r>
+        <w:rPr/>
+        <w:t>Be: futurus</w:t>
       </w:r>
     </w:p>
     <w:p>
@@ -9192,7 +9200,7 @@
     </w:r>
     <w:r>
       <w:rPr/>
-      <w:t>14</w:t>
+      <w:t>7</w:t>
     </w:r>
     <w:r>
       <w:rPr/>

</xml_diff>

<commit_message>
[650]Move participles to top in Nonfinites page in Latin drills
</commit_message>
<xml_diff>
--- a/site/drills/latin/answers.docx
+++ b/site/drills/latin/answers.docx
@@ -7076,6 +7076,527 @@
       </w:pPr>
       <w:r>
         <w:rPr/>
+        <w:t>--- PARTICIPLE ---</w:t>
+      </w:r>
+    </w:p>
+    <w:p>
+      <w:pPr>
+        <w:pStyle w:val="Normal"/>
+        <w:bidi w:val="0"/>
+        <w:jc w:val="left"/>
+        <w:rPr/>
+      </w:pPr>
+      <w:r>
+        <w:rPr/>
+      </w:r>
+    </w:p>
+    <w:p>
+      <w:pPr>
+        <w:pStyle w:val="Normal"/>
+        <w:bidi w:val="0"/>
+        <w:jc w:val="left"/>
+        <w:rPr/>
+      </w:pPr>
+      <w:r>
+        <w:rPr/>
+        <w:t>--- Present Active ---</w:t>
+      </w:r>
+    </w:p>
+    <w:p>
+      <w:pPr>
+        <w:pStyle w:val="Normal"/>
+        <w:bidi w:val="0"/>
+        <w:jc w:val="left"/>
+        <w:rPr/>
+      </w:pPr>
+      <w:r>
+        <w:rPr/>
+        <w:t>Praise: laudans</w:t>
+      </w:r>
+    </w:p>
+    <w:p>
+      <w:pPr>
+        <w:pStyle w:val="Normal"/>
+        <w:bidi w:val="0"/>
+        <w:jc w:val="left"/>
+        <w:rPr/>
+      </w:pPr>
+      <w:r>
+        <w:rPr/>
+        <w:t>Remind: monens</w:t>
+      </w:r>
+    </w:p>
+    <w:p>
+      <w:pPr>
+        <w:pStyle w:val="Normal"/>
+        <w:bidi w:val="0"/>
+        <w:jc w:val="left"/>
+        <w:rPr/>
+      </w:pPr>
+      <w:r>
+        <w:rPr/>
+        <w:t>Lead: ducens</w:t>
+      </w:r>
+    </w:p>
+    <w:p>
+      <w:pPr>
+        <w:pStyle w:val="Normal"/>
+        <w:bidi w:val="0"/>
+        <w:jc w:val="left"/>
+        <w:rPr/>
+      </w:pPr>
+      <w:r>
+        <w:rPr/>
+        <w:t>Hear: audiens</w:t>
+      </w:r>
+    </w:p>
+    <w:p>
+      <w:pPr>
+        <w:pStyle w:val="Normal"/>
+        <w:bidi w:val="0"/>
+        <w:jc w:val="left"/>
+        <w:rPr/>
+      </w:pPr>
+      <w:r>
+        <w:rPr/>
+        <w:t>Take: capiens</w:t>
+      </w:r>
+    </w:p>
+    <w:p>
+      <w:pPr>
+        <w:pStyle w:val="Normal"/>
+        <w:bidi w:val="0"/>
+        <w:jc w:val="left"/>
+        <w:rPr/>
+      </w:pPr>
+      <w:r>
+        <w:rPr/>
+      </w:r>
+    </w:p>
+    <w:p>
+      <w:pPr>
+        <w:pStyle w:val="Normal"/>
+        <w:bidi w:val="0"/>
+        <w:jc w:val="left"/>
+        <w:rPr/>
+      </w:pPr>
+      <w:r>
+        <w:rPr/>
+        <w:t>--- Perfect Passive ---</w:t>
+      </w:r>
+    </w:p>
+    <w:p>
+      <w:pPr>
+        <w:pStyle w:val="Normal"/>
+        <w:bidi w:val="0"/>
+        <w:jc w:val="left"/>
+        <w:rPr/>
+      </w:pPr>
+      <w:r>
+        <w:rPr/>
+        <w:t>Praise: laudatus</w:t>
+      </w:r>
+    </w:p>
+    <w:p>
+      <w:pPr>
+        <w:pStyle w:val="Normal"/>
+        <w:bidi w:val="0"/>
+        <w:jc w:val="left"/>
+        <w:rPr/>
+      </w:pPr>
+      <w:r>
+        <w:rPr/>
+        <w:t>Remind: monitus</w:t>
+      </w:r>
+    </w:p>
+    <w:p>
+      <w:pPr>
+        <w:pStyle w:val="Normal"/>
+        <w:bidi w:val="0"/>
+        <w:jc w:val="left"/>
+        <w:rPr/>
+      </w:pPr>
+      <w:r>
+        <w:rPr/>
+        <w:t>Lead: ductus</w:t>
+      </w:r>
+    </w:p>
+    <w:p>
+      <w:pPr>
+        <w:pStyle w:val="Normal"/>
+        <w:bidi w:val="0"/>
+        <w:jc w:val="left"/>
+        <w:rPr/>
+      </w:pPr>
+      <w:r>
+        <w:rPr/>
+        <w:t>Hear: auditus</w:t>
+      </w:r>
+    </w:p>
+    <w:p>
+      <w:pPr>
+        <w:pStyle w:val="Normal"/>
+        <w:bidi w:val="0"/>
+        <w:jc w:val="left"/>
+        <w:rPr/>
+      </w:pPr>
+      <w:r>
+        <w:rPr/>
+        <w:t>Take: captus</w:t>
+      </w:r>
+    </w:p>
+    <w:p>
+      <w:pPr>
+        <w:pStyle w:val="Normal"/>
+        <w:bidi w:val="0"/>
+        <w:jc w:val="left"/>
+        <w:rPr/>
+      </w:pPr>
+      <w:r>
+        <w:rPr/>
+      </w:r>
+    </w:p>
+    <w:p>
+      <w:pPr>
+        <w:pStyle w:val="Normal"/>
+        <w:bidi w:val="0"/>
+        <w:jc w:val="left"/>
+        <w:rPr/>
+      </w:pPr>
+      <w:r>
+        <w:rPr/>
+        <w:t>--- Future Active ---</w:t>
+      </w:r>
+    </w:p>
+    <w:p>
+      <w:pPr>
+        <w:pStyle w:val="Normal"/>
+        <w:bidi w:val="0"/>
+        <w:jc w:val="left"/>
+        <w:rPr/>
+      </w:pPr>
+      <w:r>
+        <w:rPr/>
+        <w:t>Praise: laudaturus</w:t>
+      </w:r>
+    </w:p>
+    <w:p>
+      <w:pPr>
+        <w:pStyle w:val="Normal"/>
+        <w:bidi w:val="0"/>
+        <w:jc w:val="left"/>
+        <w:rPr/>
+      </w:pPr>
+      <w:r>
+        <w:rPr/>
+        <w:t xml:space="preserve">Remind: moniturus </w:t>
+      </w:r>
+    </w:p>
+    <w:p>
+      <w:pPr>
+        <w:pStyle w:val="Normal"/>
+        <w:bidi w:val="0"/>
+        <w:jc w:val="left"/>
+        <w:rPr/>
+      </w:pPr>
+      <w:r>
+        <w:rPr/>
+        <w:t xml:space="preserve">Lead: ducturus </w:t>
+      </w:r>
+    </w:p>
+    <w:p>
+      <w:pPr>
+        <w:pStyle w:val="Normal"/>
+        <w:bidi w:val="0"/>
+        <w:jc w:val="left"/>
+        <w:rPr/>
+      </w:pPr>
+      <w:r>
+        <w:rPr/>
+        <w:t xml:space="preserve">Hear: auditurus </w:t>
+      </w:r>
+    </w:p>
+    <w:p>
+      <w:pPr>
+        <w:pStyle w:val="Normal"/>
+        <w:bidi w:val="0"/>
+        <w:jc w:val="left"/>
+        <w:rPr/>
+      </w:pPr>
+      <w:r>
+        <w:rPr/>
+        <w:t xml:space="preserve">Take: capturus </w:t>
+      </w:r>
+    </w:p>
+    <w:p>
+      <w:pPr>
+        <w:pStyle w:val="Normal"/>
+        <w:bidi w:val="0"/>
+        <w:jc w:val="left"/>
+        <w:rPr/>
+      </w:pPr>
+      <w:r>
+        <w:rPr/>
+      </w:r>
+    </w:p>
+    <w:p>
+      <w:pPr>
+        <w:pStyle w:val="Normal"/>
+        <w:bidi w:val="0"/>
+        <w:jc w:val="left"/>
+        <w:rPr/>
+      </w:pPr>
+      <w:r>
+        <w:rPr/>
+        <w:t>--- Future Passive (Gerundive) ---</w:t>
+      </w:r>
+    </w:p>
+    <w:p>
+      <w:pPr>
+        <w:pStyle w:val="Normal"/>
+        <w:bidi w:val="0"/>
+        <w:jc w:val="left"/>
+        <w:rPr/>
+      </w:pPr>
+      <w:r>
+        <w:rPr/>
+        <w:t>Praise: laudandus</w:t>
+      </w:r>
+    </w:p>
+    <w:p>
+      <w:pPr>
+        <w:pStyle w:val="Normal"/>
+        <w:bidi w:val="0"/>
+        <w:jc w:val="left"/>
+        <w:rPr/>
+      </w:pPr>
+      <w:r>
+        <w:rPr/>
+        <w:t>Remind: monendus</w:t>
+      </w:r>
+    </w:p>
+    <w:p>
+      <w:pPr>
+        <w:pStyle w:val="Normal"/>
+        <w:bidi w:val="0"/>
+        <w:jc w:val="left"/>
+        <w:rPr/>
+      </w:pPr>
+      <w:r>
+        <w:rPr/>
+        <w:t>Lead: ducendus</w:t>
+      </w:r>
+    </w:p>
+    <w:p>
+      <w:pPr>
+        <w:pStyle w:val="Normal"/>
+        <w:bidi w:val="0"/>
+        <w:jc w:val="left"/>
+        <w:rPr/>
+      </w:pPr>
+      <w:r>
+        <w:rPr/>
+        <w:t>Hear: audiendus</w:t>
+      </w:r>
+    </w:p>
+    <w:p>
+      <w:pPr>
+        <w:pStyle w:val="Normal"/>
+        <w:bidi w:val="0"/>
+        <w:jc w:val="left"/>
+        <w:rPr/>
+      </w:pPr>
+      <w:r>
+        <w:rPr/>
+        <w:t>Take: capiendus</w:t>
+      </w:r>
+    </w:p>
+    <w:p>
+      <w:pPr>
+        <w:pStyle w:val="Normal"/>
+        <w:bidi w:val="0"/>
+        <w:jc w:val="left"/>
+        <w:rPr/>
+      </w:pPr>
+      <w:r>
+        <w:rPr/>
+      </w:r>
+    </w:p>
+    <w:p>
+      <w:pPr>
+        <w:pStyle w:val="Normal"/>
+        <w:bidi w:val="0"/>
+        <w:jc w:val="left"/>
+        <w:rPr/>
+      </w:pPr>
+      <w:r>
+        <w:rPr/>
+        <w:t>--- GERUND ---</w:t>
+      </w:r>
+    </w:p>
+    <w:p>
+      <w:pPr>
+        <w:pStyle w:val="Normal"/>
+        <w:bidi w:val="0"/>
+        <w:jc w:val="left"/>
+        <w:rPr/>
+      </w:pPr>
+      <w:r>
+        <w:rPr/>
+        <w:t>Praise: laudandi</w:t>
+      </w:r>
+    </w:p>
+    <w:p>
+      <w:pPr>
+        <w:pStyle w:val="Normal"/>
+        <w:bidi w:val="0"/>
+        <w:jc w:val="left"/>
+        <w:rPr/>
+      </w:pPr>
+      <w:r>
+        <w:rPr/>
+        <w:t>Remind: monendi</w:t>
+      </w:r>
+    </w:p>
+    <w:p>
+      <w:pPr>
+        <w:pStyle w:val="Normal"/>
+        <w:bidi w:val="0"/>
+        <w:jc w:val="left"/>
+        <w:rPr/>
+      </w:pPr>
+      <w:r>
+        <w:rPr/>
+        <w:t>Lead: ducendi</w:t>
+      </w:r>
+    </w:p>
+    <w:p>
+      <w:pPr>
+        <w:pStyle w:val="Normal"/>
+        <w:bidi w:val="0"/>
+        <w:jc w:val="left"/>
+        <w:rPr/>
+      </w:pPr>
+      <w:r>
+        <w:rPr/>
+        <w:t>Hear: audiendi</w:t>
+      </w:r>
+    </w:p>
+    <w:p>
+      <w:pPr>
+        <w:pStyle w:val="Normal"/>
+        <w:bidi w:val="0"/>
+        <w:jc w:val="left"/>
+        <w:rPr/>
+      </w:pPr>
+      <w:r>
+        <w:rPr/>
+        <w:t>Take: capiendi</w:t>
+      </w:r>
+    </w:p>
+    <w:p>
+      <w:pPr>
+        <w:pStyle w:val="Normal"/>
+        <w:bidi w:val="0"/>
+        <w:jc w:val="left"/>
+        <w:rPr/>
+      </w:pPr>
+      <w:r>
+        <w:rPr/>
+      </w:r>
+    </w:p>
+    <w:p>
+      <w:pPr>
+        <w:pStyle w:val="Normal"/>
+        <w:bidi w:val="0"/>
+        <w:jc w:val="left"/>
+        <w:rPr/>
+      </w:pPr>
+      <w:r>
+        <w:rPr/>
+        <w:t>--- SUPINE ---</w:t>
+      </w:r>
+    </w:p>
+    <w:p>
+      <w:pPr>
+        <w:pStyle w:val="Normal"/>
+        <w:bidi w:val="0"/>
+        <w:jc w:val="left"/>
+        <w:rPr/>
+      </w:pPr>
+      <w:r>
+        <w:rPr/>
+        <w:t>Praise: laudatum laudatu</w:t>
+      </w:r>
+    </w:p>
+    <w:p>
+      <w:pPr>
+        <w:pStyle w:val="Normal"/>
+        <w:bidi w:val="0"/>
+        <w:jc w:val="left"/>
+        <w:rPr/>
+      </w:pPr>
+      <w:r>
+        <w:rPr/>
+        <w:t>Remind: monitum monitu</w:t>
+      </w:r>
+    </w:p>
+    <w:p>
+      <w:pPr>
+        <w:pStyle w:val="Normal"/>
+        <w:bidi w:val="0"/>
+        <w:jc w:val="left"/>
+        <w:rPr/>
+      </w:pPr>
+      <w:r>
+        <w:rPr/>
+        <w:t>Lead: ductum ductu</w:t>
+      </w:r>
+    </w:p>
+    <w:p>
+      <w:pPr>
+        <w:pStyle w:val="Normal"/>
+        <w:bidi w:val="0"/>
+        <w:jc w:val="left"/>
+        <w:rPr/>
+      </w:pPr>
+      <w:r>
+        <w:rPr/>
+        <w:t>Hear: auditum auditu</w:t>
+      </w:r>
+    </w:p>
+    <w:p>
+      <w:pPr>
+        <w:pStyle w:val="Normal"/>
+        <w:bidi w:val="0"/>
+        <w:jc w:val="left"/>
+        <w:rPr/>
+      </w:pPr>
+      <w:r>
+        <w:rPr/>
+        <w:t>Take: captum captu</w:t>
+      </w:r>
+    </w:p>
+    <w:p>
+      <w:pPr>
+        <w:pStyle w:val="Normal"/>
+        <w:bidi w:val="0"/>
+        <w:jc w:val="left"/>
+        <w:rPr/>
+      </w:pPr>
+      <w:r>
+        <w:rPr/>
+      </w:r>
+    </w:p>
+    <w:p>
+      <w:pPr>
+        <w:pStyle w:val="Normal"/>
+        <w:bidi w:val="0"/>
+        <w:jc w:val="left"/>
+        <w:rPr/>
+      </w:pPr>
+      <w:r>
+        <w:rPr/>
         <w:t>--- INFINITIVE ---</w:t>
       </w:r>
     </w:p>
@@ -7597,6 +8118,740 @@
       </w:pPr>
       <w:r>
         <w:rPr/>
+      </w:r>
+    </w:p>
+    <w:p>
+      <w:pPr>
+        <w:pStyle w:val="Normal"/>
+        <w:bidi w:val="0"/>
+        <w:jc w:val="left"/>
+        <w:rPr/>
+      </w:pPr>
+      <w:r>
+        <w:rPr/>
+      </w:r>
+    </w:p>
+    <w:p>
+      <w:pPr>
+        <w:pStyle w:val="Normal"/>
+        <w:bidi w:val="0"/>
+        <w:jc w:val="left"/>
+        <w:rPr/>
+      </w:pPr>
+      <w:r>
+        <w:rPr/>
+      </w:r>
+    </w:p>
+    <w:p>
+      <w:pPr>
+        <w:pStyle w:val="Normal"/>
+        <w:bidi w:val="0"/>
+        <w:jc w:val="left"/>
+        <w:rPr/>
+      </w:pPr>
+      <w:r>
+        <w:rPr/>
+      </w:r>
+    </w:p>
+    <w:p>
+      <w:pPr>
+        <w:pStyle w:val="Normal"/>
+        <w:bidi w:val="0"/>
+        <w:jc w:val="left"/>
+        <w:rPr/>
+      </w:pPr>
+      <w:r>
+        <w:rPr/>
+        <w:t>=== Order of verb forms in drills ===</w:t>
+      </w:r>
+    </w:p>
+    <w:p>
+      <w:pPr>
+        <w:pStyle w:val="Normal"/>
+        <w:bidi w:val="0"/>
+        <w:jc w:val="left"/>
+        <w:rPr/>
+      </w:pPr>
+      <w:r>
+        <w:rPr/>
+      </w:r>
+    </w:p>
+    <w:p>
+      <w:pPr>
+        <w:pStyle w:val="Normal"/>
+        <w:bidi w:val="0"/>
+        <w:jc w:val="left"/>
+        <w:rPr/>
+      </w:pPr>
+      <w:r>
+        <w:rPr/>
+        <w:t>--- INDICATIVE ACTIVE ---</w:t>
+      </w:r>
+    </w:p>
+    <w:p>
+      <w:pPr>
+        <w:pStyle w:val="Normal"/>
+        <w:bidi w:val="0"/>
+        <w:jc w:val="left"/>
+        <w:rPr/>
+      </w:pPr>
+      <w:r>
+        <w:rPr/>
+      </w:r>
+    </w:p>
+    <w:p>
+      <w:pPr>
+        <w:pStyle w:val="Normal"/>
+        <w:bidi w:val="0"/>
+        <w:jc w:val="left"/>
+        <w:rPr/>
+      </w:pPr>
+      <w:r>
+        <w:rPr/>
+        <w:t>--- Present ---</w:t>
+      </w:r>
+    </w:p>
+    <w:p>
+      <w:pPr>
+        <w:pStyle w:val="Normal"/>
+        <w:bidi w:val="0"/>
+        <w:jc w:val="left"/>
+        <w:rPr/>
+      </w:pPr>
+      <w:r>
+        <w:rPr/>
+      </w:r>
+    </w:p>
+    <w:p>
+      <w:pPr>
+        <w:pStyle w:val="Normal"/>
+        <w:bidi w:val="0"/>
+        <w:jc w:val="left"/>
+        <w:rPr/>
+      </w:pPr>
+      <w:r>
+        <w:rPr/>
+        <w:t>--- Imperfect ---</w:t>
+      </w:r>
+    </w:p>
+    <w:p>
+      <w:pPr>
+        <w:pStyle w:val="Normal"/>
+        <w:bidi w:val="0"/>
+        <w:jc w:val="left"/>
+        <w:rPr/>
+      </w:pPr>
+      <w:r>
+        <w:rPr/>
+      </w:r>
+    </w:p>
+    <w:p>
+      <w:pPr>
+        <w:pStyle w:val="Normal"/>
+        <w:bidi w:val="0"/>
+        <w:jc w:val="left"/>
+        <w:rPr/>
+      </w:pPr>
+      <w:r>
+        <w:rPr/>
+        <w:t>--- Future ---</w:t>
+      </w:r>
+    </w:p>
+    <w:p>
+      <w:pPr>
+        <w:pStyle w:val="Normal"/>
+        <w:bidi w:val="0"/>
+        <w:jc w:val="left"/>
+        <w:rPr/>
+      </w:pPr>
+      <w:r>
+        <w:rPr/>
+      </w:r>
+    </w:p>
+    <w:p>
+      <w:pPr>
+        <w:pStyle w:val="Normal"/>
+        <w:bidi w:val="0"/>
+        <w:jc w:val="left"/>
+        <w:rPr/>
+      </w:pPr>
+      <w:r>
+        <w:rPr/>
+        <w:t>--- Perfect ---</w:t>
+      </w:r>
+    </w:p>
+    <w:p>
+      <w:pPr>
+        <w:pStyle w:val="Normal"/>
+        <w:bidi w:val="0"/>
+        <w:jc w:val="left"/>
+        <w:rPr/>
+      </w:pPr>
+      <w:r>
+        <w:rPr/>
+      </w:r>
+    </w:p>
+    <w:p>
+      <w:pPr>
+        <w:pStyle w:val="Normal"/>
+        <w:bidi w:val="0"/>
+        <w:jc w:val="left"/>
+        <w:rPr/>
+      </w:pPr>
+      <w:r>
+        <w:rPr/>
+        <w:t>--- Pluperfect ---</w:t>
+      </w:r>
+    </w:p>
+    <w:p>
+      <w:pPr>
+        <w:pStyle w:val="Normal"/>
+        <w:bidi w:val="0"/>
+        <w:jc w:val="left"/>
+        <w:rPr/>
+      </w:pPr>
+      <w:r>
+        <w:rPr/>
+      </w:r>
+    </w:p>
+    <w:p>
+      <w:pPr>
+        <w:pStyle w:val="Normal"/>
+        <w:bidi w:val="0"/>
+        <w:jc w:val="left"/>
+        <w:rPr/>
+      </w:pPr>
+      <w:r>
+        <w:rPr/>
+        <w:t>--- Future Perfect ---</w:t>
+      </w:r>
+    </w:p>
+    <w:p>
+      <w:pPr>
+        <w:pStyle w:val="Normal"/>
+        <w:bidi w:val="0"/>
+        <w:jc w:val="left"/>
+        <w:rPr/>
+      </w:pPr>
+      <w:r>
+        <w:rPr/>
+      </w:r>
+    </w:p>
+    <w:p>
+      <w:pPr>
+        <w:pStyle w:val="Normal"/>
+        <w:bidi w:val="0"/>
+        <w:jc w:val="left"/>
+        <w:rPr/>
+      </w:pPr>
+      <w:r>
+        <w:rPr/>
+        <w:t>--- INDICATIVE PASSIVE ---</w:t>
+      </w:r>
+    </w:p>
+    <w:p>
+      <w:pPr>
+        <w:pStyle w:val="Normal"/>
+        <w:bidi w:val="0"/>
+        <w:jc w:val="left"/>
+        <w:rPr/>
+      </w:pPr>
+      <w:r>
+        <w:rPr/>
+      </w:r>
+    </w:p>
+    <w:p>
+      <w:pPr>
+        <w:pStyle w:val="Normal"/>
+        <w:bidi w:val="0"/>
+        <w:jc w:val="left"/>
+        <w:rPr/>
+      </w:pPr>
+      <w:r>
+        <w:rPr/>
+        <w:t>--- Present ---</w:t>
+      </w:r>
+    </w:p>
+    <w:p>
+      <w:pPr>
+        <w:pStyle w:val="Normal"/>
+        <w:bidi w:val="0"/>
+        <w:jc w:val="left"/>
+        <w:rPr/>
+      </w:pPr>
+      <w:r>
+        <w:rPr/>
+      </w:r>
+    </w:p>
+    <w:p>
+      <w:pPr>
+        <w:pStyle w:val="Normal"/>
+        <w:bidi w:val="0"/>
+        <w:jc w:val="left"/>
+        <w:rPr/>
+      </w:pPr>
+      <w:r>
+        <w:rPr/>
+        <w:t>--- Imperfect ---</w:t>
+      </w:r>
+    </w:p>
+    <w:p>
+      <w:pPr>
+        <w:pStyle w:val="Normal"/>
+        <w:bidi w:val="0"/>
+        <w:jc w:val="left"/>
+        <w:rPr/>
+      </w:pPr>
+      <w:r>
+        <w:rPr/>
+      </w:r>
+    </w:p>
+    <w:p>
+      <w:pPr>
+        <w:pStyle w:val="Normal"/>
+        <w:bidi w:val="0"/>
+        <w:jc w:val="left"/>
+        <w:rPr/>
+      </w:pPr>
+      <w:r>
+        <w:rPr/>
+        <w:t>--- Future ---</w:t>
+      </w:r>
+    </w:p>
+    <w:p>
+      <w:pPr>
+        <w:pStyle w:val="Normal"/>
+        <w:bidi w:val="0"/>
+        <w:jc w:val="left"/>
+        <w:rPr/>
+      </w:pPr>
+      <w:r>
+        <w:rPr/>
+      </w:r>
+    </w:p>
+    <w:p>
+      <w:pPr>
+        <w:pStyle w:val="Normal"/>
+        <w:bidi w:val="0"/>
+        <w:jc w:val="left"/>
+        <w:rPr/>
+      </w:pPr>
+      <w:r>
+        <w:rPr/>
+        <w:t>--- Perfect ---</w:t>
+      </w:r>
+    </w:p>
+    <w:p>
+      <w:pPr>
+        <w:pStyle w:val="Normal"/>
+        <w:bidi w:val="0"/>
+        <w:jc w:val="left"/>
+        <w:rPr/>
+      </w:pPr>
+      <w:r>
+        <w:rPr/>
+      </w:r>
+    </w:p>
+    <w:p>
+      <w:pPr>
+        <w:pStyle w:val="Normal"/>
+        <w:bidi w:val="0"/>
+        <w:jc w:val="left"/>
+        <w:rPr/>
+      </w:pPr>
+      <w:r>
+        <w:rPr/>
+        <w:t>--- Pluperfect ---</w:t>
+      </w:r>
+    </w:p>
+    <w:p>
+      <w:pPr>
+        <w:pStyle w:val="Normal"/>
+        <w:bidi w:val="0"/>
+        <w:jc w:val="left"/>
+        <w:rPr/>
+      </w:pPr>
+      <w:r>
+        <w:rPr/>
+      </w:r>
+    </w:p>
+    <w:p>
+      <w:pPr>
+        <w:pStyle w:val="Normal"/>
+        <w:bidi w:val="0"/>
+        <w:jc w:val="left"/>
+        <w:rPr/>
+      </w:pPr>
+      <w:r>
+        <w:rPr/>
+        <w:t>--- Future Perfect ---</w:t>
+      </w:r>
+    </w:p>
+    <w:p>
+      <w:pPr>
+        <w:pStyle w:val="Normal"/>
+        <w:bidi w:val="0"/>
+        <w:jc w:val="left"/>
+        <w:rPr/>
+      </w:pPr>
+      <w:r>
+        <w:rPr/>
+      </w:r>
+    </w:p>
+    <w:p>
+      <w:pPr>
+        <w:pStyle w:val="Normal"/>
+        <w:bidi w:val="0"/>
+        <w:jc w:val="left"/>
+        <w:rPr/>
+      </w:pPr>
+      <w:r>
+        <w:rPr/>
+        <w:t>--- SUBJUNCTIVE ACTIVE ---</w:t>
+      </w:r>
+    </w:p>
+    <w:p>
+      <w:pPr>
+        <w:pStyle w:val="Normal"/>
+        <w:bidi w:val="0"/>
+        <w:jc w:val="left"/>
+        <w:rPr/>
+      </w:pPr>
+      <w:r>
+        <w:rPr/>
+      </w:r>
+    </w:p>
+    <w:p>
+      <w:pPr>
+        <w:pStyle w:val="Normal"/>
+        <w:bidi w:val="0"/>
+        <w:jc w:val="left"/>
+        <w:rPr/>
+      </w:pPr>
+      <w:r>
+        <w:rPr/>
+        <w:t>--- Present ---</w:t>
+      </w:r>
+    </w:p>
+    <w:p>
+      <w:pPr>
+        <w:pStyle w:val="Normal"/>
+        <w:bidi w:val="0"/>
+        <w:jc w:val="left"/>
+        <w:rPr/>
+      </w:pPr>
+      <w:r>
+        <w:rPr/>
+      </w:r>
+    </w:p>
+    <w:p>
+      <w:pPr>
+        <w:pStyle w:val="Normal"/>
+        <w:bidi w:val="0"/>
+        <w:jc w:val="left"/>
+        <w:rPr/>
+      </w:pPr>
+      <w:r>
+        <w:rPr/>
+        <w:t>--- Imperfect ---</w:t>
+      </w:r>
+    </w:p>
+    <w:p>
+      <w:pPr>
+        <w:pStyle w:val="Normal"/>
+        <w:bidi w:val="0"/>
+        <w:jc w:val="left"/>
+        <w:rPr/>
+      </w:pPr>
+      <w:r>
+        <w:rPr/>
+      </w:r>
+    </w:p>
+    <w:p>
+      <w:pPr>
+        <w:pStyle w:val="Normal"/>
+        <w:bidi w:val="0"/>
+        <w:jc w:val="left"/>
+        <w:rPr/>
+      </w:pPr>
+      <w:r>
+        <w:rPr/>
+        <w:t>--- Perfect ---</w:t>
+      </w:r>
+    </w:p>
+    <w:p>
+      <w:pPr>
+        <w:pStyle w:val="Normal"/>
+        <w:bidi w:val="0"/>
+        <w:jc w:val="left"/>
+        <w:rPr/>
+      </w:pPr>
+      <w:r>
+        <w:rPr/>
+      </w:r>
+    </w:p>
+    <w:p>
+      <w:pPr>
+        <w:pStyle w:val="Normal"/>
+        <w:bidi w:val="0"/>
+        <w:jc w:val="left"/>
+        <w:rPr/>
+      </w:pPr>
+      <w:r>
+        <w:rPr/>
+        <w:t>--- Pluperfect ---</w:t>
+      </w:r>
+    </w:p>
+    <w:p>
+      <w:pPr>
+        <w:pStyle w:val="Normal"/>
+        <w:bidi w:val="0"/>
+        <w:jc w:val="left"/>
+        <w:rPr/>
+      </w:pPr>
+      <w:r>
+        <w:rPr/>
+      </w:r>
+    </w:p>
+    <w:p>
+      <w:pPr>
+        <w:pStyle w:val="Normal"/>
+        <w:bidi w:val="0"/>
+        <w:jc w:val="left"/>
+        <w:rPr/>
+      </w:pPr>
+      <w:r>
+        <w:rPr/>
+        <w:t>--- SUBJUNCTIVE PASSIVE ---</w:t>
+      </w:r>
+    </w:p>
+    <w:p>
+      <w:pPr>
+        <w:pStyle w:val="Normal"/>
+        <w:bidi w:val="0"/>
+        <w:jc w:val="left"/>
+        <w:rPr/>
+      </w:pPr>
+      <w:r>
+        <w:rPr/>
+      </w:r>
+    </w:p>
+    <w:p>
+      <w:pPr>
+        <w:pStyle w:val="Normal"/>
+        <w:bidi w:val="0"/>
+        <w:jc w:val="left"/>
+        <w:rPr/>
+      </w:pPr>
+      <w:r>
+        <w:rPr/>
+        <w:t>--- Present ---</w:t>
+      </w:r>
+    </w:p>
+    <w:p>
+      <w:pPr>
+        <w:pStyle w:val="Normal"/>
+        <w:bidi w:val="0"/>
+        <w:jc w:val="left"/>
+        <w:rPr/>
+      </w:pPr>
+      <w:r>
+        <w:rPr/>
+      </w:r>
+    </w:p>
+    <w:p>
+      <w:pPr>
+        <w:pStyle w:val="Normal"/>
+        <w:bidi w:val="0"/>
+        <w:jc w:val="left"/>
+        <w:rPr/>
+      </w:pPr>
+      <w:r>
+        <w:rPr/>
+        <w:t>--- Imperfect ---</w:t>
+      </w:r>
+    </w:p>
+    <w:p>
+      <w:pPr>
+        <w:pStyle w:val="Normal"/>
+        <w:bidi w:val="0"/>
+        <w:jc w:val="left"/>
+        <w:rPr/>
+      </w:pPr>
+      <w:r>
+        <w:rPr/>
+      </w:r>
+    </w:p>
+    <w:p>
+      <w:pPr>
+        <w:pStyle w:val="Normal"/>
+        <w:bidi w:val="0"/>
+        <w:jc w:val="left"/>
+        <w:rPr/>
+      </w:pPr>
+      <w:r>
+        <w:rPr/>
+        <w:t>--- Perfect ---</w:t>
+      </w:r>
+    </w:p>
+    <w:p>
+      <w:pPr>
+        <w:pStyle w:val="Normal"/>
+        <w:bidi w:val="0"/>
+        <w:jc w:val="left"/>
+        <w:rPr/>
+      </w:pPr>
+      <w:r>
+        <w:rPr/>
+      </w:r>
+    </w:p>
+    <w:p>
+      <w:pPr>
+        <w:pStyle w:val="Normal"/>
+        <w:bidi w:val="0"/>
+        <w:jc w:val="left"/>
+        <w:rPr/>
+      </w:pPr>
+      <w:r>
+        <w:rPr/>
+        <w:t>--- Pluperfect ---</w:t>
+      </w:r>
+    </w:p>
+    <w:p>
+      <w:pPr>
+        <w:pStyle w:val="Normal"/>
+        <w:bidi w:val="0"/>
+        <w:jc w:val="left"/>
+        <w:rPr/>
+      </w:pPr>
+      <w:r>
+        <w:rPr/>
+      </w:r>
+    </w:p>
+    <w:p>
+      <w:pPr>
+        <w:pStyle w:val="Normal"/>
+        <w:bidi w:val="0"/>
+        <w:jc w:val="left"/>
+        <w:rPr/>
+      </w:pPr>
+      <w:r>
+        <w:rPr/>
+        <w:t>--- IMPERATIVE ---</w:t>
+      </w:r>
+    </w:p>
+    <w:p>
+      <w:pPr>
+        <w:pStyle w:val="Normal"/>
+        <w:bidi w:val="0"/>
+        <w:jc w:val="left"/>
+        <w:rPr/>
+      </w:pPr>
+      <w:r>
+        <w:rPr/>
+      </w:r>
+    </w:p>
+    <w:p>
+      <w:pPr>
+        <w:pStyle w:val="Normal"/>
+        <w:bidi w:val="0"/>
+        <w:jc w:val="left"/>
+        <w:rPr/>
+      </w:pPr>
+      <w:r>
+        <w:rPr/>
+        <w:t>--- Present Active ---</w:t>
+      </w:r>
+    </w:p>
+    <w:p>
+      <w:pPr>
+        <w:pStyle w:val="Normal"/>
+        <w:bidi w:val="0"/>
+        <w:jc w:val="left"/>
+        <w:rPr/>
+      </w:pPr>
+      <w:r>
+        <w:rPr/>
+      </w:r>
+    </w:p>
+    <w:p>
+      <w:pPr>
+        <w:pStyle w:val="Normal"/>
+        <w:bidi w:val="0"/>
+        <w:jc w:val="left"/>
+        <w:rPr/>
+      </w:pPr>
+      <w:r>
+        <w:rPr/>
+        <w:t>--- Future Active ---</w:t>
+      </w:r>
+    </w:p>
+    <w:p>
+      <w:pPr>
+        <w:pStyle w:val="Normal"/>
+        <w:bidi w:val="0"/>
+        <w:jc w:val="left"/>
+        <w:rPr/>
+      </w:pPr>
+      <w:r>
+        <w:rPr/>
+      </w:r>
+    </w:p>
+    <w:p>
+      <w:pPr>
+        <w:pStyle w:val="Normal"/>
+        <w:bidi w:val="0"/>
+        <w:jc w:val="left"/>
+        <w:rPr/>
+      </w:pPr>
+      <w:r>
+        <w:rPr/>
+        <w:t>--- Present Passive ---</w:t>
+      </w:r>
+    </w:p>
+    <w:p>
+      <w:pPr>
+        <w:pStyle w:val="Normal"/>
+        <w:bidi w:val="0"/>
+        <w:jc w:val="left"/>
+        <w:rPr/>
+      </w:pPr>
+      <w:r>
+        <w:rPr/>
+      </w:r>
+    </w:p>
+    <w:p>
+      <w:pPr>
+        <w:pStyle w:val="Normal"/>
+        <w:bidi w:val="0"/>
+        <w:jc w:val="left"/>
+        <w:rPr/>
+      </w:pPr>
+      <w:r>
+        <w:rPr/>
+        <w:t>--- Future Passive ---</w:t>
+      </w:r>
+    </w:p>
+    <w:p>
+      <w:pPr>
+        <w:pStyle w:val="Normal"/>
+        <w:bidi w:val="0"/>
+        <w:jc w:val="left"/>
+        <w:rPr/>
+      </w:pPr>
+      <w:r>
+        <w:rPr/>
+      </w:r>
+    </w:p>
+    <w:p>
+      <w:pPr>
+        <w:pStyle w:val="Normal"/>
+        <w:bidi w:val="0"/>
+        <w:jc w:val="left"/>
+        <w:rPr/>
+      </w:pPr>
+      <w:r>
+        <w:rPr/>
         <w:t>--- PARTICIPLE ---</w:t>
       </w:r>
     </w:p>
@@ -7632,66 +8887,6 @@
       </w:pPr>
       <w:r>
         <w:rPr/>
-        <w:t>Praise: laudans</w:t>
-      </w:r>
-    </w:p>
-    <w:p>
-      <w:pPr>
-        <w:pStyle w:val="Normal"/>
-        <w:bidi w:val="0"/>
-        <w:jc w:val="left"/>
-        <w:rPr/>
-      </w:pPr>
-      <w:r>
-        <w:rPr/>
-        <w:t>Remind: monens</w:t>
-      </w:r>
-    </w:p>
-    <w:p>
-      <w:pPr>
-        <w:pStyle w:val="Normal"/>
-        <w:bidi w:val="0"/>
-        <w:jc w:val="left"/>
-        <w:rPr/>
-      </w:pPr>
-      <w:r>
-        <w:rPr/>
-        <w:t>Lead: ducens</w:t>
-      </w:r>
-    </w:p>
-    <w:p>
-      <w:pPr>
-        <w:pStyle w:val="Normal"/>
-        <w:bidi w:val="0"/>
-        <w:jc w:val="left"/>
-        <w:rPr/>
-      </w:pPr>
-      <w:r>
-        <w:rPr/>
-        <w:t>Hear: audiens</w:t>
-      </w:r>
-    </w:p>
-    <w:p>
-      <w:pPr>
-        <w:pStyle w:val="Normal"/>
-        <w:bidi w:val="0"/>
-        <w:jc w:val="left"/>
-        <w:rPr/>
-      </w:pPr>
-      <w:r>
-        <w:rPr/>
-        <w:t>Take: capiens</w:t>
-      </w:r>
-    </w:p>
-    <w:p>
-      <w:pPr>
-        <w:pStyle w:val="Normal"/>
-        <w:bidi w:val="0"/>
-        <w:jc w:val="left"/>
-        <w:rPr/>
-      </w:pPr>
-      <w:r>
-        <w:rPr/>
       </w:r>
     </w:p>
     <w:p>
@@ -7715,66 +8910,6 @@
       </w:pPr>
       <w:r>
         <w:rPr/>
-        <w:t>Praise: laudatus</w:t>
-      </w:r>
-    </w:p>
-    <w:p>
-      <w:pPr>
-        <w:pStyle w:val="Normal"/>
-        <w:bidi w:val="0"/>
-        <w:jc w:val="left"/>
-        <w:rPr/>
-      </w:pPr>
-      <w:r>
-        <w:rPr/>
-        <w:t>Remind: monitus</w:t>
-      </w:r>
-    </w:p>
-    <w:p>
-      <w:pPr>
-        <w:pStyle w:val="Normal"/>
-        <w:bidi w:val="0"/>
-        <w:jc w:val="left"/>
-        <w:rPr/>
-      </w:pPr>
-      <w:r>
-        <w:rPr/>
-        <w:t>Lead: ductus</w:t>
-      </w:r>
-    </w:p>
-    <w:p>
-      <w:pPr>
-        <w:pStyle w:val="Normal"/>
-        <w:bidi w:val="0"/>
-        <w:jc w:val="left"/>
-        <w:rPr/>
-      </w:pPr>
-      <w:r>
-        <w:rPr/>
-        <w:t>Hear: auditus</w:t>
-      </w:r>
-    </w:p>
-    <w:p>
-      <w:pPr>
-        <w:pStyle w:val="Normal"/>
-        <w:bidi w:val="0"/>
-        <w:jc w:val="left"/>
-        <w:rPr/>
-      </w:pPr>
-      <w:r>
-        <w:rPr/>
-        <w:t>Take: captus</w:t>
-      </w:r>
-    </w:p>
-    <w:p>
-      <w:pPr>
-        <w:pStyle w:val="Normal"/>
-        <w:bidi w:val="0"/>
-        <w:jc w:val="left"/>
-        <w:rPr/>
-      </w:pPr>
-      <w:r>
-        <w:rPr/>
       </w:r>
     </w:p>
     <w:p>
@@ -7798,66 +8933,6 @@
       </w:pPr>
       <w:r>
         <w:rPr/>
-        <w:t>Praise: laudaturus</w:t>
-      </w:r>
-    </w:p>
-    <w:p>
-      <w:pPr>
-        <w:pStyle w:val="Normal"/>
-        <w:bidi w:val="0"/>
-        <w:jc w:val="left"/>
-        <w:rPr/>
-      </w:pPr>
-      <w:r>
-        <w:rPr/>
-        <w:t xml:space="preserve">Remind: moniturus </w:t>
-      </w:r>
-    </w:p>
-    <w:p>
-      <w:pPr>
-        <w:pStyle w:val="Normal"/>
-        <w:bidi w:val="0"/>
-        <w:jc w:val="left"/>
-        <w:rPr/>
-      </w:pPr>
-      <w:r>
-        <w:rPr/>
-        <w:t xml:space="preserve">Lead: ducturus </w:t>
-      </w:r>
-    </w:p>
-    <w:p>
-      <w:pPr>
-        <w:pStyle w:val="Normal"/>
-        <w:bidi w:val="0"/>
-        <w:jc w:val="left"/>
-        <w:rPr/>
-      </w:pPr>
-      <w:r>
-        <w:rPr/>
-        <w:t xml:space="preserve">Hear: auditurus </w:t>
-      </w:r>
-    </w:p>
-    <w:p>
-      <w:pPr>
-        <w:pStyle w:val="Normal"/>
-        <w:bidi w:val="0"/>
-        <w:jc w:val="left"/>
-        <w:rPr/>
-      </w:pPr>
-      <w:r>
-        <w:rPr/>
-        <w:t xml:space="preserve">Take: capturus </w:t>
-      </w:r>
-    </w:p>
-    <w:p>
-      <w:pPr>
-        <w:pStyle w:val="Normal"/>
-        <w:bidi w:val="0"/>
-        <w:jc w:val="left"/>
-        <w:rPr/>
-      </w:pPr>
-      <w:r>
-        <w:rPr/>
       </w:r>
     </w:p>
     <w:p>
@@ -7881,66 +8956,6 @@
       </w:pPr>
       <w:r>
         <w:rPr/>
-        <w:t>Praise: laudandus</w:t>
-      </w:r>
-    </w:p>
-    <w:p>
-      <w:pPr>
-        <w:pStyle w:val="Normal"/>
-        <w:bidi w:val="0"/>
-        <w:jc w:val="left"/>
-        <w:rPr/>
-      </w:pPr>
-      <w:r>
-        <w:rPr/>
-        <w:t>Remind: monendus</w:t>
-      </w:r>
-    </w:p>
-    <w:p>
-      <w:pPr>
-        <w:pStyle w:val="Normal"/>
-        <w:bidi w:val="0"/>
-        <w:jc w:val="left"/>
-        <w:rPr/>
-      </w:pPr>
-      <w:r>
-        <w:rPr/>
-        <w:t>Lead: ducendus</w:t>
-      </w:r>
-    </w:p>
-    <w:p>
-      <w:pPr>
-        <w:pStyle w:val="Normal"/>
-        <w:bidi w:val="0"/>
-        <w:jc w:val="left"/>
-        <w:rPr/>
-      </w:pPr>
-      <w:r>
-        <w:rPr/>
-        <w:t>Hear: audiendus</w:t>
-      </w:r>
-    </w:p>
-    <w:p>
-      <w:pPr>
-        <w:pStyle w:val="Normal"/>
-        <w:bidi w:val="0"/>
-        <w:jc w:val="left"/>
-        <w:rPr/>
-      </w:pPr>
-      <w:r>
-        <w:rPr/>
-        <w:t>Take: capiendus</w:t>
-      </w:r>
-    </w:p>
-    <w:p>
-      <w:pPr>
-        <w:pStyle w:val="Normal"/>
-        <w:bidi w:val="0"/>
-        <w:jc w:val="left"/>
-        <w:rPr/>
-      </w:pPr>
-      <w:r>
-        <w:rPr/>
       </w:r>
     </w:p>
     <w:p>
@@ -7964,66 +8979,6 @@
       </w:pPr>
       <w:r>
         <w:rPr/>
-        <w:t>Praise: laudandi</w:t>
-      </w:r>
-    </w:p>
-    <w:p>
-      <w:pPr>
-        <w:pStyle w:val="Normal"/>
-        <w:bidi w:val="0"/>
-        <w:jc w:val="left"/>
-        <w:rPr/>
-      </w:pPr>
-      <w:r>
-        <w:rPr/>
-        <w:t>Remind: monendi</w:t>
-      </w:r>
-    </w:p>
-    <w:p>
-      <w:pPr>
-        <w:pStyle w:val="Normal"/>
-        <w:bidi w:val="0"/>
-        <w:jc w:val="left"/>
-        <w:rPr/>
-      </w:pPr>
-      <w:r>
-        <w:rPr/>
-        <w:t>Lead: ducendi</w:t>
-      </w:r>
-    </w:p>
-    <w:p>
-      <w:pPr>
-        <w:pStyle w:val="Normal"/>
-        <w:bidi w:val="0"/>
-        <w:jc w:val="left"/>
-        <w:rPr/>
-      </w:pPr>
-      <w:r>
-        <w:rPr/>
-        <w:t>Hear: audiendi</w:t>
-      </w:r>
-    </w:p>
-    <w:p>
-      <w:pPr>
-        <w:pStyle w:val="Normal"/>
-        <w:bidi w:val="0"/>
-        <w:jc w:val="left"/>
-        <w:rPr/>
-      </w:pPr>
-      <w:r>
-        <w:rPr/>
-        <w:t>Take: capiendi</w:t>
-      </w:r>
-    </w:p>
-    <w:p>
-      <w:pPr>
-        <w:pStyle w:val="Normal"/>
-        <w:bidi w:val="0"/>
-        <w:jc w:val="left"/>
-        <w:rPr/>
-      </w:pPr>
-      <w:r>
-        <w:rPr/>
       </w:r>
     </w:p>
     <w:p>
@@ -8047,697 +9002,18 @@
       </w:pPr>
       <w:r>
         <w:rPr/>
-        <w:t>Praise: laudatum laudatu</w:t>
-      </w:r>
-    </w:p>
-    <w:p>
-      <w:pPr>
-        <w:pStyle w:val="Normal"/>
-        <w:bidi w:val="0"/>
-        <w:jc w:val="left"/>
-        <w:rPr/>
-      </w:pPr>
-      <w:r>
-        <w:rPr/>
-        <w:t>Remind: monitum monitu</w:t>
-      </w:r>
-    </w:p>
-    <w:p>
-      <w:pPr>
-        <w:pStyle w:val="Normal"/>
-        <w:bidi w:val="0"/>
-        <w:jc w:val="left"/>
-        <w:rPr/>
-      </w:pPr>
-      <w:r>
-        <w:rPr/>
-        <w:t>Lead: ductum ductu</w:t>
-      </w:r>
-    </w:p>
-    <w:p>
-      <w:pPr>
-        <w:pStyle w:val="Normal"/>
-        <w:bidi w:val="0"/>
-        <w:jc w:val="left"/>
-        <w:rPr/>
-      </w:pPr>
-      <w:r>
-        <w:rPr/>
-        <w:t>Hear: auditum auditu</w:t>
-      </w:r>
-    </w:p>
-    <w:p>
-      <w:pPr>
-        <w:pStyle w:val="Normal"/>
-        <w:bidi w:val="0"/>
-        <w:jc w:val="left"/>
-        <w:rPr/>
-      </w:pPr>
-      <w:r>
-        <w:rPr/>
-        <w:t>Take: captum captu</w:t>
-      </w:r>
-    </w:p>
-    <w:p>
-      <w:pPr>
-        <w:pStyle w:val="Normal"/>
-        <w:bidi w:val="0"/>
-        <w:jc w:val="left"/>
-        <w:rPr/>
-      </w:pPr>
-      <w:r>
-        <w:rPr/>
-      </w:r>
-    </w:p>
-    <w:p>
-      <w:pPr>
-        <w:pStyle w:val="Normal"/>
-        <w:bidi w:val="0"/>
-        <w:jc w:val="left"/>
-        <w:rPr/>
-      </w:pPr>
-      <w:r>
-        <w:rPr/>
-      </w:r>
-    </w:p>
-    <w:p>
-      <w:pPr>
-        <w:pStyle w:val="Normal"/>
-        <w:bidi w:val="0"/>
-        <w:jc w:val="left"/>
-        <w:rPr/>
-      </w:pPr>
-      <w:r>
-        <w:rPr/>
-      </w:r>
-    </w:p>
-    <w:p>
-      <w:pPr>
-        <w:pStyle w:val="Normal"/>
-        <w:bidi w:val="0"/>
-        <w:jc w:val="left"/>
-        <w:rPr/>
-      </w:pPr>
-      <w:r>
-        <w:rPr/>
-      </w:r>
-    </w:p>
-    <w:p>
-      <w:pPr>
-        <w:pStyle w:val="Normal"/>
-        <w:bidi w:val="0"/>
-        <w:jc w:val="left"/>
-        <w:rPr/>
-      </w:pPr>
-      <w:r>
-        <w:rPr/>
-      </w:r>
-    </w:p>
-    <w:p>
-      <w:pPr>
-        <w:pStyle w:val="Normal"/>
-        <w:bidi w:val="0"/>
-        <w:jc w:val="left"/>
-        <w:rPr/>
-      </w:pPr>
-      <w:r>
-        <w:rPr/>
-        <w:t>=== Order of verb forms in drills ===</w:t>
-      </w:r>
-    </w:p>
-    <w:p>
-      <w:pPr>
-        <w:pStyle w:val="Normal"/>
-        <w:bidi w:val="0"/>
-        <w:jc w:val="left"/>
-        <w:rPr/>
-      </w:pPr>
-      <w:r>
-        <w:rPr/>
-      </w:r>
-    </w:p>
-    <w:p>
-      <w:pPr>
-        <w:pStyle w:val="Normal"/>
-        <w:bidi w:val="0"/>
-        <w:jc w:val="left"/>
-        <w:rPr/>
-      </w:pPr>
-      <w:r>
-        <w:rPr/>
-        <w:t>--- INDICATIVE ACTIVE ---</w:t>
-      </w:r>
-    </w:p>
-    <w:p>
-      <w:pPr>
-        <w:pStyle w:val="Normal"/>
-        <w:bidi w:val="0"/>
-        <w:jc w:val="left"/>
-        <w:rPr/>
-      </w:pPr>
-      <w:r>
-        <w:rPr/>
-      </w:r>
-    </w:p>
-    <w:p>
-      <w:pPr>
-        <w:pStyle w:val="Normal"/>
-        <w:bidi w:val="0"/>
-        <w:jc w:val="left"/>
-        <w:rPr/>
-      </w:pPr>
-      <w:r>
-        <w:rPr/>
-        <w:t>--- Present ---</w:t>
-      </w:r>
-    </w:p>
-    <w:p>
-      <w:pPr>
-        <w:pStyle w:val="Normal"/>
-        <w:bidi w:val="0"/>
-        <w:jc w:val="left"/>
-        <w:rPr/>
-      </w:pPr>
-      <w:r>
-        <w:rPr/>
-      </w:r>
-    </w:p>
-    <w:p>
-      <w:pPr>
-        <w:pStyle w:val="Normal"/>
-        <w:bidi w:val="0"/>
-        <w:jc w:val="left"/>
-        <w:rPr/>
-      </w:pPr>
-      <w:r>
-        <w:rPr/>
-        <w:t>--- Imperfect ---</w:t>
-      </w:r>
-    </w:p>
-    <w:p>
-      <w:pPr>
-        <w:pStyle w:val="Normal"/>
-        <w:bidi w:val="0"/>
-        <w:jc w:val="left"/>
-        <w:rPr/>
-      </w:pPr>
-      <w:r>
-        <w:rPr/>
-      </w:r>
-    </w:p>
-    <w:p>
-      <w:pPr>
-        <w:pStyle w:val="Normal"/>
-        <w:bidi w:val="0"/>
-        <w:jc w:val="left"/>
-        <w:rPr/>
-      </w:pPr>
-      <w:r>
-        <w:rPr/>
-        <w:t>--- Future ---</w:t>
-      </w:r>
-    </w:p>
-    <w:p>
-      <w:pPr>
-        <w:pStyle w:val="Normal"/>
-        <w:bidi w:val="0"/>
-        <w:jc w:val="left"/>
-        <w:rPr/>
-      </w:pPr>
-      <w:r>
-        <w:rPr/>
-      </w:r>
-    </w:p>
-    <w:p>
-      <w:pPr>
-        <w:pStyle w:val="Normal"/>
-        <w:bidi w:val="0"/>
-        <w:jc w:val="left"/>
-        <w:rPr/>
-      </w:pPr>
-      <w:r>
-        <w:rPr/>
-        <w:t>--- Perfect ---</w:t>
-      </w:r>
-    </w:p>
-    <w:p>
-      <w:pPr>
-        <w:pStyle w:val="Normal"/>
-        <w:bidi w:val="0"/>
-        <w:jc w:val="left"/>
-        <w:rPr/>
-      </w:pPr>
-      <w:r>
-        <w:rPr/>
-      </w:r>
-    </w:p>
-    <w:p>
-      <w:pPr>
-        <w:pStyle w:val="Normal"/>
-        <w:bidi w:val="0"/>
-        <w:jc w:val="left"/>
-        <w:rPr/>
-      </w:pPr>
-      <w:r>
-        <w:rPr/>
-        <w:t>--- Pluperfect ---</w:t>
-      </w:r>
-    </w:p>
-    <w:p>
-      <w:pPr>
-        <w:pStyle w:val="Normal"/>
-        <w:bidi w:val="0"/>
-        <w:jc w:val="left"/>
-        <w:rPr/>
-      </w:pPr>
-      <w:r>
-        <w:rPr/>
-      </w:r>
-    </w:p>
-    <w:p>
-      <w:pPr>
-        <w:pStyle w:val="Normal"/>
-        <w:bidi w:val="0"/>
-        <w:jc w:val="left"/>
-        <w:rPr/>
-      </w:pPr>
-      <w:r>
-        <w:rPr/>
-        <w:t>--- Future Perfect ---</w:t>
-      </w:r>
-    </w:p>
-    <w:p>
-      <w:pPr>
-        <w:pStyle w:val="Normal"/>
-        <w:bidi w:val="0"/>
-        <w:jc w:val="left"/>
-        <w:rPr/>
-      </w:pPr>
-      <w:r>
-        <w:rPr/>
-      </w:r>
-    </w:p>
-    <w:p>
-      <w:pPr>
-        <w:pStyle w:val="Normal"/>
-        <w:bidi w:val="0"/>
-        <w:jc w:val="left"/>
-        <w:rPr/>
-      </w:pPr>
-      <w:r>
-        <w:rPr/>
-        <w:t>--- INDICATIVE PASSIVE ---</w:t>
-      </w:r>
-    </w:p>
-    <w:p>
-      <w:pPr>
-        <w:pStyle w:val="Normal"/>
-        <w:bidi w:val="0"/>
-        <w:jc w:val="left"/>
-        <w:rPr/>
-      </w:pPr>
-      <w:r>
-        <w:rPr/>
-      </w:r>
-    </w:p>
-    <w:p>
-      <w:pPr>
-        <w:pStyle w:val="Normal"/>
-        <w:bidi w:val="0"/>
-        <w:jc w:val="left"/>
-        <w:rPr/>
-      </w:pPr>
-      <w:r>
-        <w:rPr/>
-        <w:t>--- Present ---</w:t>
-      </w:r>
-    </w:p>
-    <w:p>
-      <w:pPr>
-        <w:pStyle w:val="Normal"/>
-        <w:bidi w:val="0"/>
-        <w:jc w:val="left"/>
-        <w:rPr/>
-      </w:pPr>
-      <w:r>
-        <w:rPr/>
-      </w:r>
-    </w:p>
-    <w:p>
-      <w:pPr>
-        <w:pStyle w:val="Normal"/>
-        <w:bidi w:val="0"/>
-        <w:jc w:val="left"/>
-        <w:rPr/>
-      </w:pPr>
-      <w:r>
-        <w:rPr/>
-        <w:t>--- Imperfect ---</w:t>
-      </w:r>
-    </w:p>
-    <w:p>
-      <w:pPr>
-        <w:pStyle w:val="Normal"/>
-        <w:bidi w:val="0"/>
-        <w:jc w:val="left"/>
-        <w:rPr/>
-      </w:pPr>
-      <w:r>
-        <w:rPr/>
-      </w:r>
-    </w:p>
-    <w:p>
-      <w:pPr>
-        <w:pStyle w:val="Normal"/>
-        <w:bidi w:val="0"/>
-        <w:jc w:val="left"/>
-        <w:rPr/>
-      </w:pPr>
-      <w:r>
-        <w:rPr/>
-        <w:t>--- Future ---</w:t>
-      </w:r>
-    </w:p>
-    <w:p>
-      <w:pPr>
-        <w:pStyle w:val="Normal"/>
-        <w:bidi w:val="0"/>
-        <w:jc w:val="left"/>
-        <w:rPr/>
-      </w:pPr>
-      <w:r>
-        <w:rPr/>
-      </w:r>
-    </w:p>
-    <w:p>
-      <w:pPr>
-        <w:pStyle w:val="Normal"/>
-        <w:bidi w:val="0"/>
-        <w:jc w:val="left"/>
-        <w:rPr/>
-      </w:pPr>
-      <w:r>
-        <w:rPr/>
-        <w:t>--- Perfect ---</w:t>
-      </w:r>
-    </w:p>
-    <w:p>
-      <w:pPr>
-        <w:pStyle w:val="Normal"/>
-        <w:bidi w:val="0"/>
-        <w:jc w:val="left"/>
-        <w:rPr/>
-      </w:pPr>
-      <w:r>
-        <w:rPr/>
-      </w:r>
-    </w:p>
-    <w:p>
-      <w:pPr>
-        <w:pStyle w:val="Normal"/>
-        <w:bidi w:val="0"/>
-        <w:jc w:val="left"/>
-        <w:rPr/>
-      </w:pPr>
-      <w:r>
-        <w:rPr/>
-        <w:t>--- Pluperfect ---</w:t>
-      </w:r>
-    </w:p>
-    <w:p>
-      <w:pPr>
-        <w:pStyle w:val="Normal"/>
-        <w:bidi w:val="0"/>
-        <w:jc w:val="left"/>
-        <w:rPr/>
-      </w:pPr>
-      <w:r>
-        <w:rPr/>
-      </w:r>
-    </w:p>
-    <w:p>
-      <w:pPr>
-        <w:pStyle w:val="Normal"/>
-        <w:bidi w:val="0"/>
-        <w:jc w:val="left"/>
-        <w:rPr/>
-      </w:pPr>
-      <w:r>
-        <w:rPr/>
-        <w:t>--- Future Perfect ---</w:t>
-      </w:r>
-    </w:p>
-    <w:p>
-      <w:pPr>
-        <w:pStyle w:val="Normal"/>
-        <w:bidi w:val="0"/>
-        <w:jc w:val="left"/>
-        <w:rPr/>
-      </w:pPr>
-      <w:r>
-        <w:rPr/>
-      </w:r>
-    </w:p>
-    <w:p>
-      <w:pPr>
-        <w:pStyle w:val="Normal"/>
-        <w:bidi w:val="0"/>
-        <w:jc w:val="left"/>
-        <w:rPr/>
-      </w:pPr>
-      <w:r>
-        <w:rPr/>
-        <w:t>--- SUBJUNCTIVE ACTIVE ---</w:t>
-      </w:r>
-    </w:p>
-    <w:p>
-      <w:pPr>
-        <w:pStyle w:val="Normal"/>
-        <w:bidi w:val="0"/>
-        <w:jc w:val="left"/>
-        <w:rPr/>
-      </w:pPr>
-      <w:r>
-        <w:rPr/>
-      </w:r>
-    </w:p>
-    <w:p>
-      <w:pPr>
-        <w:pStyle w:val="Normal"/>
-        <w:bidi w:val="0"/>
-        <w:jc w:val="left"/>
-        <w:rPr/>
-      </w:pPr>
-      <w:r>
-        <w:rPr/>
-        <w:t>--- Present ---</w:t>
-      </w:r>
-    </w:p>
-    <w:p>
-      <w:pPr>
-        <w:pStyle w:val="Normal"/>
-        <w:bidi w:val="0"/>
-        <w:jc w:val="left"/>
-        <w:rPr/>
-      </w:pPr>
-      <w:r>
-        <w:rPr/>
-      </w:r>
-    </w:p>
-    <w:p>
-      <w:pPr>
-        <w:pStyle w:val="Normal"/>
-        <w:bidi w:val="0"/>
-        <w:jc w:val="left"/>
-        <w:rPr/>
-      </w:pPr>
-      <w:r>
-        <w:rPr/>
-        <w:t>--- Imperfect ---</w:t>
-      </w:r>
-    </w:p>
-    <w:p>
-      <w:pPr>
-        <w:pStyle w:val="Normal"/>
-        <w:bidi w:val="0"/>
-        <w:jc w:val="left"/>
-        <w:rPr/>
-      </w:pPr>
-      <w:r>
-        <w:rPr/>
-      </w:r>
-    </w:p>
-    <w:p>
-      <w:pPr>
-        <w:pStyle w:val="Normal"/>
-        <w:bidi w:val="0"/>
-        <w:jc w:val="left"/>
-        <w:rPr/>
-      </w:pPr>
-      <w:r>
-        <w:rPr/>
-        <w:t>--- Perfect ---</w:t>
-      </w:r>
-    </w:p>
-    <w:p>
-      <w:pPr>
-        <w:pStyle w:val="Normal"/>
-        <w:bidi w:val="0"/>
-        <w:jc w:val="left"/>
-        <w:rPr/>
-      </w:pPr>
-      <w:r>
-        <w:rPr/>
-      </w:r>
-    </w:p>
-    <w:p>
-      <w:pPr>
-        <w:pStyle w:val="Normal"/>
-        <w:bidi w:val="0"/>
-        <w:jc w:val="left"/>
-        <w:rPr/>
-      </w:pPr>
-      <w:r>
-        <w:rPr/>
-        <w:t>--- Pluperfect ---</w:t>
-      </w:r>
-    </w:p>
-    <w:p>
-      <w:pPr>
-        <w:pStyle w:val="Normal"/>
-        <w:bidi w:val="0"/>
-        <w:jc w:val="left"/>
-        <w:rPr/>
-      </w:pPr>
-      <w:r>
-        <w:rPr/>
-      </w:r>
-    </w:p>
-    <w:p>
-      <w:pPr>
-        <w:pStyle w:val="Normal"/>
-        <w:bidi w:val="0"/>
-        <w:jc w:val="left"/>
-        <w:rPr/>
-      </w:pPr>
-      <w:r>
-        <w:rPr/>
-        <w:t>--- SUBJUNCTIVE PASSIVE ---</w:t>
-      </w:r>
-    </w:p>
-    <w:p>
-      <w:pPr>
-        <w:pStyle w:val="Normal"/>
-        <w:bidi w:val="0"/>
-        <w:jc w:val="left"/>
-        <w:rPr/>
-      </w:pPr>
-      <w:r>
-        <w:rPr/>
-      </w:r>
-    </w:p>
-    <w:p>
-      <w:pPr>
-        <w:pStyle w:val="Normal"/>
-        <w:bidi w:val="0"/>
-        <w:jc w:val="left"/>
-        <w:rPr/>
-      </w:pPr>
-      <w:r>
-        <w:rPr/>
-        <w:t>--- Present ---</w:t>
-      </w:r>
-    </w:p>
-    <w:p>
-      <w:pPr>
-        <w:pStyle w:val="Normal"/>
-        <w:bidi w:val="0"/>
-        <w:jc w:val="left"/>
-        <w:rPr/>
-      </w:pPr>
-      <w:r>
-        <w:rPr/>
-      </w:r>
-    </w:p>
-    <w:p>
-      <w:pPr>
-        <w:pStyle w:val="Normal"/>
-        <w:bidi w:val="0"/>
-        <w:jc w:val="left"/>
-        <w:rPr/>
-      </w:pPr>
-      <w:r>
-        <w:rPr/>
-        <w:t>--- Imperfect ---</w:t>
-      </w:r>
-    </w:p>
-    <w:p>
-      <w:pPr>
-        <w:pStyle w:val="Normal"/>
-        <w:bidi w:val="0"/>
-        <w:jc w:val="left"/>
-        <w:rPr/>
-      </w:pPr>
-      <w:r>
-        <w:rPr/>
-      </w:r>
-    </w:p>
-    <w:p>
-      <w:pPr>
-        <w:pStyle w:val="Normal"/>
-        <w:bidi w:val="0"/>
-        <w:jc w:val="left"/>
-        <w:rPr/>
-      </w:pPr>
-      <w:r>
-        <w:rPr/>
-        <w:t>--- Perfect ---</w:t>
-      </w:r>
-    </w:p>
-    <w:p>
-      <w:pPr>
-        <w:pStyle w:val="Normal"/>
-        <w:bidi w:val="0"/>
-        <w:jc w:val="left"/>
-        <w:rPr/>
-      </w:pPr>
-      <w:r>
-        <w:rPr/>
-      </w:r>
-    </w:p>
-    <w:p>
-      <w:pPr>
-        <w:pStyle w:val="Normal"/>
-        <w:bidi w:val="0"/>
-        <w:jc w:val="left"/>
-        <w:rPr/>
-      </w:pPr>
-      <w:r>
-        <w:rPr/>
-        <w:t>--- Pluperfect ---</w:t>
-      </w:r>
-    </w:p>
-    <w:p>
-      <w:pPr>
-        <w:pStyle w:val="Normal"/>
-        <w:bidi w:val="0"/>
-        <w:jc w:val="left"/>
-        <w:rPr/>
-      </w:pPr>
-      <w:r>
-        <w:rPr/>
-      </w:r>
-    </w:p>
-    <w:p>
-      <w:pPr>
-        <w:pStyle w:val="Normal"/>
-        <w:bidi w:val="0"/>
-        <w:jc w:val="left"/>
-        <w:rPr/>
-      </w:pPr>
-      <w:r>
-        <w:rPr/>
-        <w:t>--- IMPERATIVE ---</w:t>
+      </w:r>
+    </w:p>
+    <w:p>
+      <w:pPr>
+        <w:pStyle w:val="Normal"/>
+        <w:bidi w:val="0"/>
+        <w:jc w:val="left"/>
+        <w:rPr/>
+      </w:pPr>
+      <w:r>
+        <w:rPr/>
+        <w:t>--- INFINITIVE ---</w:t>
       </w:r>
     </w:p>
     <w:p>
@@ -8783,6 +9059,75 @@
       </w:pPr>
       <w:r>
         <w:rPr/>
+        <w:t>--- Present Passive ---</w:t>
+      </w:r>
+    </w:p>
+    <w:p>
+      <w:pPr>
+        <w:pStyle w:val="Normal"/>
+        <w:bidi w:val="0"/>
+        <w:jc w:val="left"/>
+        <w:rPr/>
+      </w:pPr>
+      <w:r>
+        <w:rPr/>
+      </w:r>
+    </w:p>
+    <w:p>
+      <w:pPr>
+        <w:pStyle w:val="Normal"/>
+        <w:bidi w:val="0"/>
+        <w:jc w:val="left"/>
+        <w:rPr/>
+      </w:pPr>
+      <w:r>
+        <w:rPr/>
+        <w:t>--- Perfect Active ---</w:t>
+      </w:r>
+    </w:p>
+    <w:p>
+      <w:pPr>
+        <w:pStyle w:val="Normal"/>
+        <w:bidi w:val="0"/>
+        <w:jc w:val="left"/>
+        <w:rPr/>
+      </w:pPr>
+      <w:r>
+        <w:rPr/>
+      </w:r>
+    </w:p>
+    <w:p>
+      <w:pPr>
+        <w:pStyle w:val="Normal"/>
+        <w:bidi w:val="0"/>
+        <w:jc w:val="left"/>
+        <w:rPr/>
+      </w:pPr>
+      <w:r>
+        <w:rPr/>
+        <w:t>--- Perfect Passive ---</w:t>
+      </w:r>
+    </w:p>
+    <w:p>
+      <w:pPr>
+        <w:pStyle w:val="Normal"/>
+        <w:bidi w:val="0"/>
+        <w:jc w:val="left"/>
+        <w:rPr/>
+      </w:pPr>
+      <w:r>
+        <w:rPr/>
+      </w:r>
+    </w:p>
+    <w:p>
+      <w:pPr>
+        <w:pStyle w:val="Normal"/>
+        <w:bidi w:val="0"/>
+        <w:jc w:val="left"/>
+        <w:rPr/>
+      </w:pPr>
+      <w:r>
+        <w:rPr/>
         <w:t>--- Future Active ---</w:t>
       </w:r>
     </w:p>
@@ -8806,29 +9151,6 @@
       </w:pPr>
       <w:r>
         <w:rPr/>
-        <w:t>--- Present Passive ---</w:t>
-      </w:r>
-    </w:p>
-    <w:p>
-      <w:pPr>
-        <w:pStyle w:val="Normal"/>
-        <w:bidi w:val="0"/>
-        <w:jc w:val="left"/>
-        <w:rPr/>
-      </w:pPr>
-      <w:r>
-        <w:rPr/>
-      </w:r>
-    </w:p>
-    <w:p>
-      <w:pPr>
-        <w:pStyle w:val="Normal"/>
-        <w:bidi w:val="0"/>
-        <w:jc w:val="left"/>
-        <w:rPr/>
-      </w:pPr>
-      <w:r>
-        <w:rPr/>
         <w:t>--- Future Passive ---</w:t>
       </w:r>
     </w:p>
@@ -8852,306 +9174,6 @@
       </w:pPr>
       <w:r>
         <w:rPr/>
-        <w:t>--- INFINITIVE ---</w:t>
-      </w:r>
-    </w:p>
-    <w:p>
-      <w:pPr>
-        <w:pStyle w:val="Normal"/>
-        <w:bidi w:val="0"/>
-        <w:jc w:val="left"/>
-        <w:rPr/>
-      </w:pPr>
-      <w:r>
-        <w:rPr/>
-      </w:r>
-    </w:p>
-    <w:p>
-      <w:pPr>
-        <w:pStyle w:val="Normal"/>
-        <w:bidi w:val="0"/>
-        <w:jc w:val="left"/>
-        <w:rPr/>
-      </w:pPr>
-      <w:r>
-        <w:rPr/>
-        <w:t>--- Present Active ---</w:t>
-      </w:r>
-    </w:p>
-    <w:p>
-      <w:pPr>
-        <w:pStyle w:val="Normal"/>
-        <w:bidi w:val="0"/>
-        <w:jc w:val="left"/>
-        <w:rPr/>
-      </w:pPr>
-      <w:r>
-        <w:rPr/>
-      </w:r>
-    </w:p>
-    <w:p>
-      <w:pPr>
-        <w:pStyle w:val="Normal"/>
-        <w:bidi w:val="0"/>
-        <w:jc w:val="left"/>
-        <w:rPr/>
-      </w:pPr>
-      <w:r>
-        <w:rPr/>
-        <w:t>--- Present Passive ---</w:t>
-      </w:r>
-    </w:p>
-    <w:p>
-      <w:pPr>
-        <w:pStyle w:val="Normal"/>
-        <w:bidi w:val="0"/>
-        <w:jc w:val="left"/>
-        <w:rPr/>
-      </w:pPr>
-      <w:r>
-        <w:rPr/>
-      </w:r>
-    </w:p>
-    <w:p>
-      <w:pPr>
-        <w:pStyle w:val="Normal"/>
-        <w:bidi w:val="0"/>
-        <w:jc w:val="left"/>
-        <w:rPr/>
-      </w:pPr>
-      <w:r>
-        <w:rPr/>
-        <w:t>--- Perfect Active ---</w:t>
-      </w:r>
-    </w:p>
-    <w:p>
-      <w:pPr>
-        <w:pStyle w:val="Normal"/>
-        <w:bidi w:val="0"/>
-        <w:jc w:val="left"/>
-        <w:rPr/>
-      </w:pPr>
-      <w:r>
-        <w:rPr/>
-      </w:r>
-    </w:p>
-    <w:p>
-      <w:pPr>
-        <w:pStyle w:val="Normal"/>
-        <w:bidi w:val="0"/>
-        <w:jc w:val="left"/>
-        <w:rPr/>
-      </w:pPr>
-      <w:r>
-        <w:rPr/>
-        <w:t>--- Perfect Passive ---</w:t>
-      </w:r>
-    </w:p>
-    <w:p>
-      <w:pPr>
-        <w:pStyle w:val="Normal"/>
-        <w:bidi w:val="0"/>
-        <w:jc w:val="left"/>
-        <w:rPr/>
-      </w:pPr>
-      <w:r>
-        <w:rPr/>
-      </w:r>
-    </w:p>
-    <w:p>
-      <w:pPr>
-        <w:pStyle w:val="Normal"/>
-        <w:bidi w:val="0"/>
-        <w:jc w:val="left"/>
-        <w:rPr/>
-      </w:pPr>
-      <w:r>
-        <w:rPr/>
-        <w:t>--- Future Active ---</w:t>
-      </w:r>
-    </w:p>
-    <w:p>
-      <w:pPr>
-        <w:pStyle w:val="Normal"/>
-        <w:bidi w:val="0"/>
-        <w:jc w:val="left"/>
-        <w:rPr/>
-      </w:pPr>
-      <w:r>
-        <w:rPr/>
-      </w:r>
-    </w:p>
-    <w:p>
-      <w:pPr>
-        <w:pStyle w:val="Normal"/>
-        <w:bidi w:val="0"/>
-        <w:jc w:val="left"/>
-        <w:rPr/>
-      </w:pPr>
-      <w:r>
-        <w:rPr/>
-        <w:t>--- Future Passive ---</w:t>
-      </w:r>
-    </w:p>
-    <w:p>
-      <w:pPr>
-        <w:pStyle w:val="Normal"/>
-        <w:bidi w:val="0"/>
-        <w:jc w:val="left"/>
-        <w:rPr/>
-      </w:pPr>
-      <w:r>
-        <w:rPr/>
-      </w:r>
-    </w:p>
-    <w:p>
-      <w:pPr>
-        <w:pStyle w:val="Normal"/>
-        <w:bidi w:val="0"/>
-        <w:jc w:val="left"/>
-        <w:rPr/>
-      </w:pPr>
-      <w:r>
-        <w:rPr/>
-        <w:t>--- PARTICIPLE ---</w:t>
-      </w:r>
-    </w:p>
-    <w:p>
-      <w:pPr>
-        <w:pStyle w:val="Normal"/>
-        <w:bidi w:val="0"/>
-        <w:jc w:val="left"/>
-        <w:rPr/>
-      </w:pPr>
-      <w:r>
-        <w:rPr/>
-      </w:r>
-    </w:p>
-    <w:p>
-      <w:pPr>
-        <w:pStyle w:val="Normal"/>
-        <w:bidi w:val="0"/>
-        <w:jc w:val="left"/>
-        <w:rPr/>
-      </w:pPr>
-      <w:r>
-        <w:rPr/>
-        <w:t>--- Present Active ---</w:t>
-      </w:r>
-    </w:p>
-    <w:p>
-      <w:pPr>
-        <w:pStyle w:val="Normal"/>
-        <w:bidi w:val="0"/>
-        <w:jc w:val="left"/>
-        <w:rPr/>
-      </w:pPr>
-      <w:r>
-        <w:rPr/>
-      </w:r>
-    </w:p>
-    <w:p>
-      <w:pPr>
-        <w:pStyle w:val="Normal"/>
-        <w:bidi w:val="0"/>
-        <w:jc w:val="left"/>
-        <w:rPr/>
-      </w:pPr>
-      <w:r>
-        <w:rPr/>
-        <w:t>--- Perfect Passive ---</w:t>
-      </w:r>
-    </w:p>
-    <w:p>
-      <w:pPr>
-        <w:pStyle w:val="Normal"/>
-        <w:bidi w:val="0"/>
-        <w:jc w:val="left"/>
-        <w:rPr/>
-      </w:pPr>
-      <w:r>
-        <w:rPr/>
-      </w:r>
-    </w:p>
-    <w:p>
-      <w:pPr>
-        <w:pStyle w:val="Normal"/>
-        <w:bidi w:val="0"/>
-        <w:jc w:val="left"/>
-        <w:rPr/>
-      </w:pPr>
-      <w:r>
-        <w:rPr/>
-        <w:t>--- Future Active ---</w:t>
-      </w:r>
-    </w:p>
-    <w:p>
-      <w:pPr>
-        <w:pStyle w:val="Normal"/>
-        <w:bidi w:val="0"/>
-        <w:jc w:val="left"/>
-        <w:rPr/>
-      </w:pPr>
-      <w:r>
-        <w:rPr/>
-      </w:r>
-    </w:p>
-    <w:p>
-      <w:pPr>
-        <w:pStyle w:val="Normal"/>
-        <w:bidi w:val="0"/>
-        <w:jc w:val="left"/>
-        <w:rPr/>
-      </w:pPr>
-      <w:r>
-        <w:rPr/>
-        <w:t>--- Future Passive (Gerundive) ---</w:t>
-      </w:r>
-    </w:p>
-    <w:p>
-      <w:pPr>
-        <w:pStyle w:val="Normal"/>
-        <w:bidi w:val="0"/>
-        <w:jc w:val="left"/>
-        <w:rPr/>
-      </w:pPr>
-      <w:r>
-        <w:rPr/>
-      </w:r>
-    </w:p>
-    <w:p>
-      <w:pPr>
-        <w:pStyle w:val="Normal"/>
-        <w:bidi w:val="0"/>
-        <w:jc w:val="left"/>
-        <w:rPr/>
-      </w:pPr>
-      <w:r>
-        <w:rPr/>
-        <w:t>--- GERUND ---</w:t>
-      </w:r>
-    </w:p>
-    <w:p>
-      <w:pPr>
-        <w:pStyle w:val="Normal"/>
-        <w:bidi w:val="0"/>
-        <w:jc w:val="left"/>
-        <w:rPr/>
-      </w:pPr>
-      <w:r>
-        <w:rPr/>
-      </w:r>
-    </w:p>
-    <w:p>
-      <w:pPr>
-        <w:pStyle w:val="Normal"/>
-        <w:bidi w:val="0"/>
-        <w:jc w:val="left"/>
-        <w:rPr/>
-      </w:pPr>
-      <w:r>
-        <w:rPr/>
-        <w:t>--- SUPINE ---</w:t>
       </w:r>
     </w:p>
     <w:p>
@@ -9200,7 +9222,7 @@
     </w:r>
     <w:r>
       <w:rPr/>
-      <w:t>7</w:t>
+      <w:t>14</w:t>
     </w:r>
     <w:r>
       <w:rPr/>

</xml_diff>